<commit_message>
Enable Spring to sign requests.
</commit_message>
<xml_diff>
--- a/docs/Configure Shibboleth SAML for Spring Boot Applications More Secure.docx
+++ b/docs/Configure Shibboleth SAML for Spring Boot Applications More Secure.docx
@@ -213,7 +213,21 @@
         <w:rPr>
           <w:rFonts w:ascii="Times New Roman" w:hAnsi="Times New Roman" w:cs="Times New Roman"/>
         </w:rPr>
-        <w:t>Run the install.bat under %PROJECT_HOME%</w:t>
+        <w:t xml:space="preserve">Run the </w:t>
+      </w:r>
+      <w:r>
+        <w:rPr>
+          <w:rFonts w:ascii="Times New Roman" w:hAnsi="Times New Roman" w:cs="Times New Roman"/>
+          <w:b/>
+          <w:bCs/>
+        </w:rPr>
+        <w:t>install.bat</w:t>
+      </w:r>
+      <w:r>
+        <w:rPr>
+          <w:rFonts w:ascii="Times New Roman" w:hAnsi="Times New Roman" w:cs="Times New Roman"/>
+        </w:rPr>
+        <w:t xml:space="preserve"> under %PROJECT_HOME%</w:t>
       </w:r>
       <w:r>
         <w:rPr>
@@ -451,19 +465,9 @@
           <w:b/>
           <w:bCs/>
         </w:rPr>
-        <w:t>net.shibboleth.idp.</w:t>
-      </w:r>
-      <w:proofErr w:type="gramStart"/>
-      <w:r>
-        <w:rPr>
-          <w:rFonts w:ascii="Times New Roman" w:hAnsi="Times New Roman" w:cs="Times New Roman"/>
-          <w:b/>
-          <w:bCs/>
-        </w:rPr>
-        <w:t>plugin.jetty</w:t>
+        <w:t>net.shibboleth.idp.plugin.jetty</w:t>
       </w:r>
       <w:proofErr w:type="spellEnd"/>
-      <w:proofErr w:type="gramEnd"/>
     </w:p>
     <w:p>
       <w:pPr>
@@ -490,7 +494,6 @@
         <w:t>“</w:t>
       </w:r>
       <w:proofErr w:type="spellStart"/>
-      <w:proofErr w:type="gramStart"/>
       <w:r>
         <w:rPr>
           <w:rFonts w:ascii="Times New Roman" w:hAnsi="Times New Roman" w:cs="Times New Roman"/>
@@ -498,7 +501,6 @@
         <w:t>jetty.Core</w:t>
       </w:r>
       <w:proofErr w:type="spellEnd"/>
-      <w:proofErr w:type="gramEnd"/>
       <w:r>
         <w:rPr>
           <w:rFonts w:ascii="Times New Roman" w:hAnsi="Times New Roman" w:cs="Times New Roman"/>
@@ -537,17 +539,9 @@
         <w:rPr>
           <w:rFonts w:ascii="Times New Roman" w:hAnsi="Times New Roman" w:cs="Times New Roman"/>
         </w:rPr>
-        <w:t>net.shibboleth.idp.</w:t>
-      </w:r>
-      <w:proofErr w:type="gramStart"/>
-      <w:r>
-        <w:rPr>
-          <w:rFonts w:ascii="Times New Roman" w:hAnsi="Times New Roman" w:cs="Times New Roman"/>
-        </w:rPr>
-        <w:t>plugin.jetty</w:t>
+        <w:t>net.shibboleth.idp.plugin.jetty</w:t>
       </w:r>
       <w:proofErr w:type="spellEnd"/>
-      <w:proofErr w:type="gramEnd"/>
       <w:r>
         <w:rPr>
           <w:rFonts w:ascii="Times New Roman" w:hAnsi="Times New Roman" w:cs="Times New Roman"/>
@@ -1415,26 +1409,43 @@
           <w:b/>
           <w:bCs/>
         </w:rPr>
-        <w:t>springboot-</w:t>
-      </w:r>
-      <w:proofErr w:type="gramStart"/>
-      <w:r>
-        <w:rPr>
-          <w:rFonts w:ascii="Times New Roman" w:hAnsi="Times New Roman" w:cs="Times New Roman"/>
-          <w:b/>
-          <w:bCs/>
-        </w:rPr>
-        <w:t>server.p</w:t>
-      </w:r>
-      <w:proofErr w:type="gramEnd"/>
-      <w:r>
-        <w:rPr>
-          <w:rFonts w:ascii="Times New Roman" w:hAnsi="Times New Roman" w:cs="Times New Roman"/>
-          <w:b/>
-          <w:bCs/>
-        </w:rPr>
-        <w:t>12</w:t>
-      </w:r>
+        <w:t xml:space="preserve">springboot-server.p12 </w:t>
+      </w:r>
+      <w:r>
+        <w:rPr>
+          <w:rFonts w:ascii="Times New Roman" w:hAnsi="Times New Roman" w:cs="Times New Roman"/>
+          <w:b/>
+          <w:bCs/>
+        </w:rPr>
+        <w:t>^</w:t>
+      </w:r>
+    </w:p>
+    <w:p>
+      <w:pPr>
+        <w:rPr>
+          <w:rFonts w:ascii="Times New Roman" w:hAnsi="Times New Roman" w:cs="Times New Roman"/>
+          <w:b/>
+          <w:bCs/>
+        </w:rPr>
+      </w:pPr>
+      <w:r>
+        <w:rPr>
+          <w:rFonts w:ascii="Times New Roman" w:hAnsi="Times New Roman" w:cs="Times New Roman"/>
+          <w:b/>
+          <w:bCs/>
+        </w:rPr>
+        <w:t xml:space="preserve">  -</w:t>
+      </w:r>
+      <w:proofErr w:type="spellStart"/>
+      <w:r>
+        <w:rPr>
+          <w:rFonts w:ascii="Times New Roman" w:hAnsi="Times New Roman" w:cs="Times New Roman"/>
+          <w:b/>
+          <w:bCs/>
+        </w:rPr>
+        <w:t>storepass</w:t>
+      </w:r>
+      <w:proofErr w:type="spellEnd"/>
       <w:r>
         <w:rPr>
           <w:rFonts w:ascii="Times New Roman" w:hAnsi="Times New Roman" w:cs="Times New Roman"/>
@@ -1443,13 +1454,23 @@
         </w:rPr>
         <w:t xml:space="preserve"> </w:t>
       </w:r>
-      <w:r>
-        <w:rPr>
-          <w:rFonts w:ascii="Times New Roman" w:hAnsi="Times New Roman" w:cs="Times New Roman"/>
-          <w:b/>
-          <w:bCs/>
-        </w:rPr>
-        <w:t>^</w:t>
+      <w:proofErr w:type="spellStart"/>
+      <w:r>
+        <w:rPr>
+          <w:rFonts w:ascii="Times New Roman" w:hAnsi="Times New Roman" w:cs="Times New Roman"/>
+          <w:b/>
+          <w:bCs/>
+        </w:rPr>
+        <w:t>changeit</w:t>
+      </w:r>
+      <w:proofErr w:type="spellEnd"/>
+      <w:r>
+        <w:rPr>
+          <w:rFonts w:ascii="Times New Roman" w:hAnsi="Times New Roman" w:cs="Times New Roman"/>
+          <w:b/>
+          <w:bCs/>
+        </w:rPr>
+        <w:t xml:space="preserve"> ^</w:t>
       </w:r>
     </w:p>
     <w:p>
@@ -1475,7 +1496,7 @@
           <w:b/>
           <w:bCs/>
         </w:rPr>
-        <w:t>storepass</w:t>
+        <w:t>keypass</w:t>
       </w:r>
       <w:proofErr w:type="spellEnd"/>
       <w:r>
@@ -1528,7 +1549,7 @@
           <w:b/>
           <w:bCs/>
         </w:rPr>
-        <w:t>keypass</w:t>
+        <w:t>dname</w:t>
       </w:r>
       <w:proofErr w:type="spellEnd"/>
       <w:r>
@@ -1537,8 +1558,148 @@
           <w:b/>
           <w:bCs/>
         </w:rPr>
+        <w:t xml:space="preserve"> "CN=localhost, OU=Development, O=Dragon, L=Local, ST=MD, C=US" ^</w:t>
+      </w:r>
+    </w:p>
+    <w:p>
+      <w:pPr>
+        <w:rPr>
+          <w:rFonts w:ascii="Times New Roman" w:hAnsi="Times New Roman" w:cs="Times New Roman"/>
+          <w:b/>
+          <w:bCs/>
+        </w:rPr>
+      </w:pPr>
+      <w:r>
+        <w:rPr>
+          <w:rFonts w:ascii="Times New Roman" w:hAnsi="Times New Roman" w:cs="Times New Roman"/>
+          <w:b/>
+          <w:bCs/>
+        </w:rPr>
+        <w:t xml:space="preserve">  -</w:t>
+      </w:r>
+      <w:proofErr w:type="spellStart"/>
+      <w:r>
+        <w:rPr>
+          <w:rFonts w:ascii="Times New Roman" w:hAnsi="Times New Roman" w:cs="Times New Roman"/>
+          <w:b/>
+          <w:bCs/>
+        </w:rPr>
+        <w:t>ext</w:t>
+      </w:r>
+      <w:proofErr w:type="spellEnd"/>
+      <w:r>
+        <w:rPr>
+          <w:rFonts w:ascii="Times New Roman" w:hAnsi="Times New Roman" w:cs="Times New Roman"/>
+          <w:b/>
+          <w:bCs/>
+        </w:rPr>
+        <w:t xml:space="preserve"> "SAN=dns:localhost,ip:127.0.0.1"</w:t>
+      </w:r>
+    </w:p>
+    <w:p>
+      <w:pPr>
+        <w:rPr>
+          <w:rFonts w:ascii="Times New Roman" w:hAnsi="Times New Roman" w:cs="Times New Roman"/>
+        </w:rPr>
+      </w:pPr>
+    </w:p>
+    <w:p>
+      <w:pPr>
+        <w:rPr>
+          <w:rFonts w:ascii="Times New Roman" w:hAnsi="Times New Roman" w:cs="Times New Roman"/>
+        </w:rPr>
+      </w:pPr>
+      <w:r>
+        <w:rPr>
+          <w:rFonts w:ascii="Times New Roman" w:hAnsi="Times New Roman" w:cs="Times New Roman"/>
+        </w:rPr>
+        <w:t xml:space="preserve">It generates </w:t>
+      </w:r>
+      <w:r>
+        <w:rPr>
+          <w:rFonts w:ascii="Times New Roman" w:hAnsi="Times New Roman" w:cs="Times New Roman"/>
+          <w:b/>
+          <w:bCs/>
+        </w:rPr>
+        <w:t>springboot-server.p12</w:t>
+      </w:r>
+      <w:r>
+        <w:rPr>
+          <w:rFonts w:ascii="Times New Roman" w:hAnsi="Times New Roman" w:cs="Times New Roman"/>
+        </w:rPr>
         <w:t xml:space="preserve"> </w:t>
       </w:r>
+      <w:r>
+        <w:rPr>
+          <w:rFonts w:ascii="Times New Roman" w:hAnsi="Times New Roman" w:cs="Times New Roman"/>
+        </w:rPr>
+        <w:t xml:space="preserve">under </w:t>
+      </w:r>
+      <w:r>
+        <w:rPr>
+          <w:rFonts w:ascii="Times New Roman" w:hAnsi="Times New Roman" w:cs="Times New Roman"/>
+          <w:b/>
+          <w:bCs/>
+        </w:rPr>
+        <w:t>%PROJECT_HOME%/</w:t>
+      </w:r>
+      <w:r>
+        <w:rPr>
+          <w:rFonts w:ascii="Times New Roman" w:hAnsi="Times New Roman" w:cs="Times New Roman"/>
+          <w:b/>
+          <w:bCs/>
+        </w:rPr>
+        <w:t>spring-certs</w:t>
+      </w:r>
+      <w:r>
+        <w:rPr>
+          <w:rFonts w:ascii="Times New Roman" w:hAnsi="Times New Roman" w:cs="Times New Roman"/>
+          <w:b/>
+          <w:bCs/>
+        </w:rPr>
+        <w:t>.</w:t>
+      </w:r>
+    </w:p>
+    <w:p>
+      <w:pPr>
+        <w:rPr>
+          <w:rFonts w:ascii="Times New Roman" w:hAnsi="Times New Roman" w:cs="Times New Roman"/>
+          <w:b/>
+          <w:bCs/>
+        </w:rPr>
+      </w:pPr>
+      <w:r>
+        <w:rPr>
+          <w:rFonts w:ascii="Times New Roman" w:hAnsi="Times New Roman" w:cs="Times New Roman"/>
+        </w:rPr>
+        <w:t xml:space="preserve">Copy </w:t>
+      </w:r>
+      <w:r>
+        <w:rPr>
+          <w:rFonts w:ascii="Times New Roman" w:hAnsi="Times New Roman" w:cs="Times New Roman"/>
+          <w:b/>
+          <w:bCs/>
+        </w:rPr>
+        <w:t>springboot-server.p12</w:t>
+      </w:r>
+      <w:r>
+        <w:rPr>
+          <w:rFonts w:ascii="Times New Roman" w:hAnsi="Times New Roman" w:cs="Times New Roman"/>
+        </w:rPr>
+        <w:t xml:space="preserve"> </w:t>
+      </w:r>
+      <w:r>
+        <w:rPr>
+          <w:rFonts w:ascii="Times New Roman" w:hAnsi="Times New Roman" w:cs="Times New Roman"/>
+        </w:rPr>
+        <w:t>to</w:t>
+      </w:r>
+      <w:r>
+        <w:rPr>
+          <w:rFonts w:ascii="Times New Roman" w:hAnsi="Times New Roman" w:cs="Times New Roman"/>
+        </w:rPr>
+        <w:t xml:space="preserve"> </w:t>
+      </w:r>
       <w:proofErr w:type="spellStart"/>
       <w:r>
         <w:rPr>
@@ -1546,7 +1707,7 @@
           <w:b/>
           <w:bCs/>
         </w:rPr>
-        <w:t>changeit</w:t>
+        <w:t>src</w:t>
       </w:r>
       <w:proofErr w:type="spellEnd"/>
       <w:r>
@@ -1555,59 +1716,41 @@
           <w:b/>
           <w:bCs/>
         </w:rPr>
-        <w:t xml:space="preserve"> ^</w:t>
-      </w:r>
-    </w:p>
-    <w:p>
-      <w:pPr>
-        <w:rPr>
-          <w:rFonts w:ascii="Times New Roman" w:hAnsi="Times New Roman" w:cs="Times New Roman"/>
-          <w:b/>
-          <w:bCs/>
-        </w:rPr>
-      </w:pPr>
-      <w:r>
-        <w:rPr>
-          <w:rFonts w:ascii="Times New Roman" w:hAnsi="Times New Roman" w:cs="Times New Roman"/>
-          <w:b/>
-          <w:bCs/>
-        </w:rPr>
-        <w:t xml:space="preserve">  -</w:t>
+        <w:t>/main/resources</w:t>
+      </w:r>
+      <w:r>
+        <w:rPr>
+          <w:rFonts w:ascii="Times New Roman" w:hAnsi="Times New Roman" w:cs="Times New Roman"/>
+          <w:b/>
+          <w:bCs/>
+        </w:rPr>
+        <w:t xml:space="preserve">/certs </w:t>
+      </w:r>
+      <w:r>
+        <w:rPr>
+          <w:rFonts w:ascii="Times New Roman" w:hAnsi="Times New Roman" w:cs="Times New Roman"/>
+        </w:rPr>
+        <w:t>and</w:t>
+      </w:r>
+      <w:r>
+        <w:rPr>
+          <w:rFonts w:ascii="Times New Roman" w:hAnsi="Times New Roman" w:cs="Times New Roman"/>
+        </w:rPr>
+        <w:t xml:space="preserve"> specify </w:t>
       </w:r>
       <w:proofErr w:type="spellStart"/>
       <w:r>
         <w:rPr>
           <w:rFonts w:ascii="Times New Roman" w:hAnsi="Times New Roman" w:cs="Times New Roman"/>
-          <w:b/>
-          <w:bCs/>
-        </w:rPr>
-        <w:t>dname</w:t>
+        </w:rPr>
+        <w:t>ssl</w:t>
       </w:r>
       <w:proofErr w:type="spellEnd"/>
       <w:r>
         <w:rPr>
           <w:rFonts w:ascii="Times New Roman" w:hAnsi="Times New Roman" w:cs="Times New Roman"/>
-          <w:b/>
-          <w:bCs/>
-        </w:rPr>
-        <w:t xml:space="preserve"> "CN=localhost, OU=Development, O=Dragon, L=Local, ST=MD, C=US" ^</w:t>
-      </w:r>
-    </w:p>
-    <w:p>
-      <w:pPr>
-        <w:rPr>
-          <w:rFonts w:ascii="Times New Roman" w:hAnsi="Times New Roman" w:cs="Times New Roman"/>
-          <w:b/>
-          <w:bCs/>
-        </w:rPr>
-      </w:pPr>
-      <w:r>
-        <w:rPr>
-          <w:rFonts w:ascii="Times New Roman" w:hAnsi="Times New Roman" w:cs="Times New Roman"/>
-          <w:b/>
-          <w:bCs/>
-        </w:rPr>
-        <w:t xml:space="preserve">  -</w:t>
+        </w:rPr>
+        <w:t xml:space="preserve"> properties in </w:t>
       </w:r>
       <w:proofErr w:type="spellStart"/>
       <w:r>
@@ -1616,7 +1759,7 @@
           <w:b/>
           <w:bCs/>
         </w:rPr>
-        <w:t>ext</w:t>
+        <w:t>application.yml</w:t>
       </w:r>
       <w:proofErr w:type="spellEnd"/>
       <w:r>
@@ -1625,142 +1768,6 @@
           <w:b/>
           <w:bCs/>
         </w:rPr>
-        <w:t xml:space="preserve"> "SAN=dns:</w:t>
-      </w:r>
-      <w:proofErr w:type="gramStart"/>
-      <w:r>
-        <w:rPr>
-          <w:rFonts w:ascii="Times New Roman" w:hAnsi="Times New Roman" w:cs="Times New Roman"/>
-          <w:b/>
-          <w:bCs/>
-        </w:rPr>
-        <w:t>localhost,ip</w:t>
-      </w:r>
-      <w:proofErr w:type="gramEnd"/>
-      <w:r>
-        <w:rPr>
-          <w:rFonts w:ascii="Times New Roman" w:hAnsi="Times New Roman" w:cs="Times New Roman"/>
-          <w:b/>
-          <w:bCs/>
-        </w:rPr>
-        <w:t>:127.0.0.1"</w:t>
-      </w:r>
-    </w:p>
-    <w:p>
-      <w:pPr>
-        <w:rPr>
-          <w:rFonts w:ascii="Times New Roman" w:hAnsi="Times New Roman" w:cs="Times New Roman"/>
-        </w:rPr>
-      </w:pPr>
-    </w:p>
-    <w:p>
-      <w:pPr>
-        <w:rPr>
-          <w:rFonts w:ascii="Times New Roman" w:hAnsi="Times New Roman" w:cs="Times New Roman"/>
-          <w:b/>
-          <w:bCs/>
-        </w:rPr>
-      </w:pPr>
-      <w:r>
-        <w:rPr>
-          <w:rFonts w:ascii="Times New Roman" w:hAnsi="Times New Roman" w:cs="Times New Roman"/>
-        </w:rPr>
-        <w:t xml:space="preserve">Copy </w:t>
-      </w:r>
-      <w:r>
-        <w:rPr>
-          <w:rFonts w:ascii="Times New Roman" w:hAnsi="Times New Roman" w:cs="Times New Roman"/>
-        </w:rPr>
-        <w:t>springboot-</w:t>
-      </w:r>
-      <w:proofErr w:type="gramStart"/>
-      <w:r>
-        <w:rPr>
-          <w:rFonts w:ascii="Times New Roman" w:hAnsi="Times New Roman" w:cs="Times New Roman"/>
-        </w:rPr>
-        <w:t>server.p</w:t>
-      </w:r>
-      <w:proofErr w:type="gramEnd"/>
-      <w:r>
-        <w:rPr>
-          <w:rFonts w:ascii="Times New Roman" w:hAnsi="Times New Roman" w:cs="Times New Roman"/>
-        </w:rPr>
-        <w:t>12</w:t>
-      </w:r>
-      <w:r>
-        <w:rPr>
-          <w:rFonts w:ascii="Times New Roman" w:hAnsi="Times New Roman" w:cs="Times New Roman"/>
-        </w:rPr>
-        <w:t xml:space="preserve"> under </w:t>
-      </w:r>
-      <w:proofErr w:type="spellStart"/>
-      <w:r>
-        <w:rPr>
-          <w:rFonts w:ascii="Times New Roman" w:hAnsi="Times New Roman" w:cs="Times New Roman"/>
-          <w:b/>
-          <w:bCs/>
-        </w:rPr>
-        <w:t>src</w:t>
-      </w:r>
-      <w:proofErr w:type="spellEnd"/>
-      <w:r>
-        <w:rPr>
-          <w:rFonts w:ascii="Times New Roman" w:hAnsi="Times New Roman" w:cs="Times New Roman"/>
-          <w:b/>
-          <w:bCs/>
-        </w:rPr>
-        <w:t>/main/resources</w:t>
-      </w:r>
-      <w:r>
-        <w:rPr>
-          <w:rFonts w:ascii="Times New Roman" w:hAnsi="Times New Roman" w:cs="Times New Roman"/>
-          <w:b/>
-          <w:bCs/>
-        </w:rPr>
-        <w:t xml:space="preserve">/certs </w:t>
-      </w:r>
-      <w:r>
-        <w:rPr>
-          <w:rFonts w:ascii="Times New Roman" w:hAnsi="Times New Roman" w:cs="Times New Roman"/>
-        </w:rPr>
-        <w:t>and</w:t>
-      </w:r>
-      <w:r>
-        <w:rPr>
-          <w:rFonts w:ascii="Times New Roman" w:hAnsi="Times New Roman" w:cs="Times New Roman"/>
-        </w:rPr>
-        <w:t xml:space="preserve"> specify </w:t>
-      </w:r>
-      <w:proofErr w:type="spellStart"/>
-      <w:r>
-        <w:rPr>
-          <w:rFonts w:ascii="Times New Roman" w:hAnsi="Times New Roman" w:cs="Times New Roman"/>
-        </w:rPr>
-        <w:t>ssl</w:t>
-      </w:r>
-      <w:proofErr w:type="spellEnd"/>
-      <w:r>
-        <w:rPr>
-          <w:rFonts w:ascii="Times New Roman" w:hAnsi="Times New Roman" w:cs="Times New Roman"/>
-        </w:rPr>
-        <w:t xml:space="preserve"> properties in </w:t>
-      </w:r>
-      <w:proofErr w:type="spellStart"/>
-      <w:r>
-        <w:rPr>
-          <w:rFonts w:ascii="Times New Roman" w:hAnsi="Times New Roman" w:cs="Times New Roman"/>
-          <w:b/>
-          <w:bCs/>
-        </w:rPr>
-        <w:t>application.yml</w:t>
-      </w:r>
-      <w:proofErr w:type="spellEnd"/>
-      <w:r>
-        <w:rPr>
-          <w:rFonts w:ascii="Times New Roman" w:hAnsi="Times New Roman" w:cs="Times New Roman"/>
-          <w:b/>
-          <w:bCs/>
-        </w:rPr>
         <w:t>:</w:t>
       </w:r>
     </w:p>
@@ -1773,6 +1780,7 @@
       <w:r>
         <w:rPr>
           <w:rFonts w:ascii="Times New Roman" w:hAnsi="Times New Roman" w:cs="Times New Roman"/>
+          <w:noProof/>
         </w:rPr>
         <w:drawing>
           <wp:inline distT="0" distB="0" distL="0" distR="0" wp14:anchorId="2EA5AF23" wp14:editId="2C57B923">
@@ -1824,21 +1832,512 @@
           <w:rFonts w:ascii="Times New Roman" w:hAnsi="Times New Roman" w:cs="Times New Roman"/>
         </w:rPr>
       </w:pPr>
-    </w:p>
-    <w:p>
-      <w:pPr>
-        <w:rPr>
-          <w:rFonts w:ascii="Times New Roman" w:hAnsi="Times New Roman" w:cs="Times New Roman"/>
-        </w:rPr>
-      </w:pPr>
       <w:r>
         <w:rPr>
           <w:rFonts w:ascii="Times New Roman" w:hAnsi="Times New Roman" w:cs="Times New Roman"/>
         </w:rPr>
         <w:lastRenderedPageBreak/>
+        <w:t xml:space="preserve">Generate SAML signing keys (see </w:t>
+      </w:r>
+      <w:r>
+        <w:rPr>
+          <w:rFonts w:ascii="Times New Roman" w:hAnsi="Times New Roman" w:cs="Times New Roman"/>
+          <w:b/>
+          <w:bCs/>
+        </w:rPr>
+        <w:t>openssl-generate-saml-keys.bat</w:t>
+      </w:r>
+      <w:r>
+        <w:rPr>
+          <w:rFonts w:ascii="Times New Roman" w:hAnsi="Times New Roman" w:cs="Times New Roman"/>
+        </w:rPr>
+        <w:t>)</w:t>
+      </w:r>
+    </w:p>
+    <w:p>
+      <w:pPr>
+        <w:rPr>
+          <w:rFonts w:ascii="Times New Roman" w:hAnsi="Times New Roman" w:cs="Times New Roman"/>
+          <w:b/>
+          <w:bCs/>
+        </w:rPr>
+      </w:pPr>
+      <w:proofErr w:type="spellStart"/>
+      <w:r>
+        <w:rPr>
+          <w:rFonts w:ascii="Times New Roman" w:hAnsi="Times New Roman" w:cs="Times New Roman"/>
+          <w:b/>
+          <w:bCs/>
+        </w:rPr>
+        <w:t>openssl</w:t>
+      </w:r>
+      <w:proofErr w:type="spellEnd"/>
+      <w:r>
+        <w:rPr>
+          <w:rFonts w:ascii="Times New Roman" w:hAnsi="Times New Roman" w:cs="Times New Roman"/>
+          <w:b/>
+          <w:bCs/>
+        </w:rPr>
+        <w:t xml:space="preserve"> req -x509 -</w:t>
+      </w:r>
+      <w:proofErr w:type="spellStart"/>
+      <w:r>
+        <w:rPr>
+          <w:rFonts w:ascii="Times New Roman" w:hAnsi="Times New Roman" w:cs="Times New Roman"/>
+          <w:b/>
+          <w:bCs/>
+        </w:rPr>
+        <w:t>newkey</w:t>
+      </w:r>
+      <w:proofErr w:type="spellEnd"/>
+      <w:r>
+        <w:rPr>
+          <w:rFonts w:ascii="Times New Roman" w:hAnsi="Times New Roman" w:cs="Times New Roman"/>
+          <w:b/>
+          <w:bCs/>
+        </w:rPr>
+        <w:t xml:space="preserve"> rsa:2048 ^</w:t>
+      </w:r>
+    </w:p>
+    <w:p>
+      <w:pPr>
+        <w:rPr>
+          <w:rFonts w:ascii="Times New Roman" w:hAnsi="Times New Roman" w:cs="Times New Roman"/>
+          <w:b/>
+          <w:bCs/>
+        </w:rPr>
+      </w:pPr>
+      <w:r>
+        <w:rPr>
+          <w:rFonts w:ascii="Times New Roman" w:hAnsi="Times New Roman" w:cs="Times New Roman"/>
+          <w:b/>
+          <w:bCs/>
+        </w:rPr>
+        <w:t xml:space="preserve">  -</w:t>
+      </w:r>
+      <w:proofErr w:type="spellStart"/>
+      <w:r>
+        <w:rPr>
+          <w:rFonts w:ascii="Times New Roman" w:hAnsi="Times New Roman" w:cs="Times New Roman"/>
+          <w:b/>
+          <w:bCs/>
+        </w:rPr>
+        <w:t>keyout</w:t>
+      </w:r>
+      <w:proofErr w:type="spellEnd"/>
+      <w:r>
+        <w:rPr>
+          <w:rFonts w:ascii="Times New Roman" w:hAnsi="Times New Roman" w:cs="Times New Roman"/>
+          <w:b/>
+          <w:bCs/>
+        </w:rPr>
+        <w:t xml:space="preserve"> spring-</w:t>
+      </w:r>
+      <w:proofErr w:type="spellStart"/>
+      <w:r>
+        <w:rPr>
+          <w:rFonts w:ascii="Times New Roman" w:hAnsi="Times New Roman" w:cs="Times New Roman"/>
+          <w:b/>
+          <w:bCs/>
+        </w:rPr>
+        <w:t>saml.key</w:t>
+      </w:r>
+      <w:proofErr w:type="spellEnd"/>
+      <w:r>
+        <w:rPr>
+          <w:rFonts w:ascii="Times New Roman" w:hAnsi="Times New Roman" w:cs="Times New Roman"/>
+          <w:b/>
+          <w:bCs/>
+        </w:rPr>
+        <w:t xml:space="preserve"> ^</w:t>
+      </w:r>
+    </w:p>
+    <w:p>
+      <w:pPr>
+        <w:rPr>
+          <w:rFonts w:ascii="Times New Roman" w:hAnsi="Times New Roman" w:cs="Times New Roman"/>
+          <w:b/>
+          <w:bCs/>
+        </w:rPr>
+      </w:pPr>
+      <w:r>
+        <w:rPr>
+          <w:rFonts w:ascii="Times New Roman" w:hAnsi="Times New Roman" w:cs="Times New Roman"/>
+          <w:b/>
+          <w:bCs/>
+        </w:rPr>
+        <w:t xml:space="preserve">  -out spring-saml.crt ^</w:t>
+      </w:r>
+    </w:p>
+    <w:p>
+      <w:pPr>
+        <w:rPr>
+          <w:rFonts w:ascii="Times New Roman" w:hAnsi="Times New Roman" w:cs="Times New Roman"/>
+          <w:b/>
+          <w:bCs/>
+        </w:rPr>
+      </w:pPr>
+      <w:r>
+        <w:rPr>
+          <w:rFonts w:ascii="Times New Roman" w:hAnsi="Times New Roman" w:cs="Times New Roman"/>
+          <w:b/>
+          <w:bCs/>
+        </w:rPr>
+        <w:t xml:space="preserve">  -sha256 ^</w:t>
+      </w:r>
+    </w:p>
+    <w:p>
+      <w:pPr>
+        <w:rPr>
+          <w:rFonts w:ascii="Times New Roman" w:hAnsi="Times New Roman" w:cs="Times New Roman"/>
+          <w:b/>
+          <w:bCs/>
+        </w:rPr>
+      </w:pPr>
+      <w:r>
+        <w:rPr>
+          <w:rFonts w:ascii="Times New Roman" w:hAnsi="Times New Roman" w:cs="Times New Roman"/>
+          <w:b/>
+          <w:bCs/>
+        </w:rPr>
+        <w:t xml:space="preserve">  -days 3650 ^</w:t>
+      </w:r>
+    </w:p>
+    <w:p>
+      <w:pPr>
+        <w:rPr>
+          <w:rFonts w:ascii="Times New Roman" w:hAnsi="Times New Roman" w:cs="Times New Roman"/>
+          <w:b/>
+          <w:bCs/>
+        </w:rPr>
+      </w:pPr>
+      <w:r>
+        <w:rPr>
+          <w:rFonts w:ascii="Times New Roman" w:hAnsi="Times New Roman" w:cs="Times New Roman"/>
+          <w:b/>
+          <w:bCs/>
+        </w:rPr>
+        <w:t xml:space="preserve">  -nodes ^</w:t>
+      </w:r>
+    </w:p>
+    <w:p>
+      <w:pPr>
+        <w:rPr>
+          <w:rFonts w:ascii="Times New Roman" w:hAnsi="Times New Roman" w:cs="Times New Roman"/>
+          <w:b/>
+          <w:bCs/>
+        </w:rPr>
+      </w:pPr>
+      <w:r>
+        <w:rPr>
+          <w:rFonts w:ascii="Times New Roman" w:hAnsi="Times New Roman" w:cs="Times New Roman"/>
+          <w:b/>
+          <w:bCs/>
+        </w:rPr>
+        <w:t xml:space="preserve">  -subj "/CN=</w:t>
+      </w:r>
+      <w:proofErr w:type="spellStart"/>
+      <w:r>
+        <w:rPr>
+          <w:rFonts w:ascii="Times New Roman" w:hAnsi="Times New Roman" w:cs="Times New Roman"/>
+          <w:b/>
+          <w:bCs/>
+        </w:rPr>
+        <w:t>SpringBoot_Shibboleth_SAML_App</w:t>
+      </w:r>
+      <w:proofErr w:type="spellEnd"/>
+      <w:r>
+        <w:rPr>
+          <w:rFonts w:ascii="Times New Roman" w:hAnsi="Times New Roman" w:cs="Times New Roman"/>
+          <w:b/>
+          <w:bCs/>
+        </w:rPr>
+        <w:t>/O=Dragon/C=US"</w:t>
+      </w:r>
+    </w:p>
+    <w:p>
+      <w:pPr>
+        <w:rPr>
+          <w:rFonts w:ascii="Times New Roman" w:hAnsi="Times New Roman" w:cs="Times New Roman"/>
+        </w:rPr>
+      </w:pPr>
+      <w:r>
+        <w:rPr>
+          <w:rFonts w:ascii="Times New Roman" w:hAnsi="Times New Roman" w:cs="Times New Roman"/>
+        </w:rPr>
+        <w:t xml:space="preserve">It generates </w:t>
+      </w:r>
+      <w:r>
+        <w:rPr>
+          <w:rFonts w:ascii="Times New Roman" w:hAnsi="Times New Roman" w:cs="Times New Roman"/>
+          <w:b/>
+          <w:bCs/>
+        </w:rPr>
+        <w:t>spring-saml.crt</w:t>
+      </w:r>
+      <w:r>
+        <w:rPr>
+          <w:rFonts w:ascii="Times New Roman" w:hAnsi="Times New Roman" w:cs="Times New Roman"/>
+        </w:rPr>
+        <w:t xml:space="preserve"> and </w:t>
+      </w:r>
+      <w:r>
+        <w:rPr>
+          <w:rFonts w:ascii="Times New Roman" w:hAnsi="Times New Roman" w:cs="Times New Roman"/>
+          <w:b/>
+          <w:bCs/>
+        </w:rPr>
+        <w:t>spring-</w:t>
+      </w:r>
+      <w:proofErr w:type="spellStart"/>
+      <w:r>
+        <w:rPr>
+          <w:rFonts w:ascii="Times New Roman" w:hAnsi="Times New Roman" w:cs="Times New Roman"/>
+          <w:b/>
+          <w:bCs/>
+        </w:rPr>
+        <w:t>saml.key</w:t>
+      </w:r>
+      <w:proofErr w:type="spellEnd"/>
+      <w:r>
+        <w:rPr>
+          <w:rFonts w:ascii="Times New Roman" w:hAnsi="Times New Roman" w:cs="Times New Roman"/>
+        </w:rPr>
+        <w:t xml:space="preserve"> under </w:t>
+      </w:r>
+      <w:r>
+        <w:rPr>
+          <w:rFonts w:ascii="Times New Roman" w:hAnsi="Times New Roman" w:cs="Times New Roman"/>
+          <w:b/>
+          <w:bCs/>
+        </w:rPr>
+        <w:t>%PROJECT_HOME%/</w:t>
+      </w:r>
+      <w:r>
+        <w:rPr>
+          <w:rFonts w:ascii="Times New Roman" w:hAnsi="Times New Roman" w:cs="Times New Roman"/>
+          <w:b/>
+          <w:bCs/>
+        </w:rPr>
+        <w:t>spring-certs</w:t>
+      </w:r>
+      <w:r>
+        <w:rPr>
+          <w:rFonts w:ascii="Times New Roman" w:hAnsi="Times New Roman" w:cs="Times New Roman"/>
+          <w:b/>
+          <w:bCs/>
+        </w:rPr>
+        <w:t>.</w:t>
+      </w:r>
+    </w:p>
+    <w:p>
+      <w:pPr>
+        <w:rPr>
+          <w:rFonts w:ascii="Times New Roman" w:hAnsi="Times New Roman" w:cs="Times New Roman"/>
+        </w:rPr>
+      </w:pPr>
+      <w:r>
+        <w:rPr>
+          <w:rFonts w:ascii="Times New Roman" w:hAnsi="Times New Roman" w:cs="Times New Roman"/>
+        </w:rPr>
+        <w:t xml:space="preserve">Copy </w:t>
+      </w:r>
+      <w:r>
+        <w:rPr>
+          <w:rFonts w:ascii="Times New Roman" w:hAnsi="Times New Roman" w:cs="Times New Roman"/>
+          <w:b/>
+          <w:bCs/>
+        </w:rPr>
+        <w:t>spring-saml.crt</w:t>
+      </w:r>
+      <w:r>
+        <w:rPr>
+          <w:rFonts w:ascii="Times New Roman" w:hAnsi="Times New Roman" w:cs="Times New Roman"/>
+        </w:rPr>
+        <w:t xml:space="preserve"> and </w:t>
+      </w:r>
+      <w:r>
+        <w:rPr>
+          <w:rFonts w:ascii="Times New Roman" w:hAnsi="Times New Roman" w:cs="Times New Roman"/>
+          <w:b/>
+          <w:bCs/>
+        </w:rPr>
+        <w:t>spring-</w:t>
+      </w:r>
+      <w:proofErr w:type="spellStart"/>
+      <w:r>
+        <w:rPr>
+          <w:rFonts w:ascii="Times New Roman" w:hAnsi="Times New Roman" w:cs="Times New Roman"/>
+          <w:b/>
+          <w:bCs/>
+        </w:rPr>
+        <w:t>saml.key</w:t>
+      </w:r>
+      <w:proofErr w:type="spellEnd"/>
+      <w:r>
+        <w:rPr>
+          <w:rFonts w:ascii="Times New Roman" w:hAnsi="Times New Roman" w:cs="Times New Roman"/>
+        </w:rPr>
+        <w:t xml:space="preserve"> </w:t>
+      </w:r>
+      <w:r>
+        <w:rPr>
+          <w:rFonts w:ascii="Times New Roman" w:hAnsi="Times New Roman" w:cs="Times New Roman"/>
+        </w:rPr>
+        <w:t xml:space="preserve">to </w:t>
+      </w:r>
+      <w:proofErr w:type="spellStart"/>
+      <w:r>
+        <w:rPr>
+          <w:rFonts w:ascii="Times New Roman" w:hAnsi="Times New Roman" w:cs="Times New Roman"/>
+          <w:b/>
+          <w:bCs/>
+        </w:rPr>
+        <w:t>src</w:t>
+      </w:r>
+      <w:proofErr w:type="spellEnd"/>
+      <w:r>
+        <w:rPr>
+          <w:rFonts w:ascii="Times New Roman" w:hAnsi="Times New Roman" w:cs="Times New Roman"/>
+          <w:b/>
+          <w:bCs/>
+        </w:rPr>
+        <w:t>/main/resources</w:t>
+      </w:r>
+      <w:r>
+        <w:rPr>
+          <w:rFonts w:ascii="Times New Roman" w:hAnsi="Times New Roman" w:cs="Times New Roman"/>
+          <w:b/>
+          <w:bCs/>
+        </w:rPr>
+        <w:t>/</w:t>
+      </w:r>
+      <w:proofErr w:type="spellStart"/>
+      <w:r>
+        <w:rPr>
+          <w:rFonts w:ascii="Times New Roman" w:hAnsi="Times New Roman" w:cs="Times New Roman"/>
+          <w:b/>
+          <w:bCs/>
+        </w:rPr>
+        <w:t>saml</w:t>
+      </w:r>
+      <w:proofErr w:type="spellEnd"/>
+      <w:r>
+        <w:rPr>
+          <w:rFonts w:ascii="Times New Roman" w:hAnsi="Times New Roman" w:cs="Times New Roman"/>
+          <w:b/>
+          <w:bCs/>
+        </w:rPr>
+        <w:t>/</w:t>
+      </w:r>
+      <w:proofErr w:type="spellStart"/>
+      <w:r>
+        <w:rPr>
+          <w:rFonts w:ascii="Times New Roman" w:hAnsi="Times New Roman" w:cs="Times New Roman"/>
+          <w:b/>
+          <w:bCs/>
+        </w:rPr>
+        <w:t>signingcerts</w:t>
+      </w:r>
+      <w:proofErr w:type="spellEnd"/>
+      <w:r>
+        <w:rPr>
+          <w:rFonts w:ascii="Times New Roman" w:hAnsi="Times New Roman" w:cs="Times New Roman"/>
+          <w:b/>
+          <w:bCs/>
+        </w:rPr>
+        <w:t xml:space="preserve"> </w:t>
+      </w:r>
+      <w:r>
+        <w:rPr>
+          <w:rFonts w:ascii="Times New Roman" w:hAnsi="Times New Roman" w:cs="Times New Roman"/>
+        </w:rPr>
+        <w:t xml:space="preserve">and specify values in </w:t>
+      </w:r>
+      <w:proofErr w:type="spellStart"/>
+      <w:r>
+        <w:rPr>
+          <w:rFonts w:ascii="Times New Roman" w:hAnsi="Times New Roman" w:cs="Times New Roman"/>
+          <w:b/>
+          <w:bCs/>
+        </w:rPr>
+        <w:t>application.yml</w:t>
+      </w:r>
+      <w:proofErr w:type="spellEnd"/>
+      <w:r>
+        <w:rPr>
+          <w:rFonts w:ascii="Times New Roman" w:hAnsi="Times New Roman" w:cs="Times New Roman"/>
+        </w:rPr>
+        <w:t>:</w:t>
+      </w:r>
+    </w:p>
+    <w:p>
+      <w:pPr>
+        <w:rPr>
+          <w:rFonts w:ascii="Times New Roman" w:hAnsi="Times New Roman" w:cs="Times New Roman"/>
+        </w:rPr>
+      </w:pPr>
+      <w:r>
+        <w:rPr>
+          <w:rFonts w:ascii="Times New Roman" w:hAnsi="Times New Roman" w:cs="Times New Roman"/>
+        </w:rPr>
+        <w:drawing>
+          <wp:inline distT="0" distB="0" distL="0" distR="0" wp14:anchorId="4DA2259B" wp14:editId="129AEAAC">
+            <wp:extent cx="5943600" cy="2264410"/>
+            <wp:effectExtent l="0" t="0" r="0" b="2540"/>
+            <wp:docPr id="2094934918" name="Picture 1"/>
+            <wp:cNvGraphicFramePr>
+              <a:graphicFrameLocks xmlns:a="http://schemas.openxmlformats.org/drawingml/2006/main" noChangeAspect="1"/>
+            </wp:cNvGraphicFramePr>
+            <a:graphic xmlns:a="http://schemas.openxmlformats.org/drawingml/2006/main">
+              <a:graphicData uri="http://schemas.openxmlformats.org/drawingml/2006/picture">
+                <pic:pic xmlns:pic="http://schemas.openxmlformats.org/drawingml/2006/picture">
+                  <pic:nvPicPr>
+                    <pic:cNvPr id="2094934918" name=""/>
+                    <pic:cNvPicPr/>
+                  </pic:nvPicPr>
+                  <pic:blipFill>
+                    <a:blip r:embed="rId7"/>
+                    <a:stretch>
+                      <a:fillRect/>
+                    </a:stretch>
+                  </pic:blipFill>
+                  <pic:spPr>
+                    <a:xfrm>
+                      <a:off x="0" y="0"/>
+                      <a:ext cx="5943600" cy="2264410"/>
+                    </a:xfrm>
+                    <a:prstGeom prst="rect">
+                      <a:avLst/>
+                    </a:prstGeom>
+                  </pic:spPr>
+                </pic:pic>
+              </a:graphicData>
+            </a:graphic>
+          </wp:inline>
+        </w:drawing>
+      </w:r>
+    </w:p>
+    <w:p>
+      <w:pPr>
+        <w:rPr>
+          <w:rFonts w:ascii="Times New Roman" w:hAnsi="Times New Roman" w:cs="Times New Roman"/>
+        </w:rPr>
+      </w:pPr>
+    </w:p>
+    <w:p>
+      <w:pPr>
+        <w:rPr>
+          <w:rFonts w:ascii="Times New Roman" w:hAnsi="Times New Roman" w:cs="Times New Roman"/>
+        </w:rPr>
+      </w:pPr>
+      <w:r>
+        <w:rPr>
+          <w:rFonts w:ascii="Times New Roman" w:hAnsi="Times New Roman" w:cs="Times New Roman"/>
+        </w:rPr>
         <w:t xml:space="preserve">Obtain Shibboleth IdP metadata from </w:t>
       </w:r>
-      <w:hyperlink r:id="rId7" w:history="1">
+      <w:hyperlink r:id="rId8" w:history="1">
         <w:r>
           <w:rPr>
             <w:rStyle w:val="Hyperlink"/>
@@ -1856,7 +2355,7 @@
         </w:rPr>
         <w:t xml:space="preserve">or </w:t>
       </w:r>
-      <w:hyperlink r:id="rId8" w:history="1">
+      <w:hyperlink r:id="rId9" w:history="1">
         <w:r>
           <w:rPr>
             <w:rStyle w:val="Hyperlink"/>
@@ -1959,6 +2458,7 @@
           <w:rFonts w:ascii="Times New Roman" w:hAnsi="Times New Roman" w:cs="Times New Roman"/>
           <w:noProof/>
         </w:rPr>
+        <w:lastRenderedPageBreak/>
         <w:drawing>
           <wp:inline distT="0" distB="0" distL="0" distR="0" wp14:anchorId="639C6BD0" wp14:editId="10191682">
             <wp:extent cx="5943600" cy="2159635"/>
@@ -1975,7 +2475,7 @@
                     <pic:cNvPicPr/>
                   </pic:nvPicPr>
                   <pic:blipFill>
-                    <a:blip r:embed="rId9"/>
+                    <a:blip r:embed="rId10"/>
                     <a:stretch>
                       <a:fillRect/>
                     </a:stretch>
@@ -2013,6 +2513,258 @@
         <w:rPr>
           <w:rFonts w:ascii="Times New Roman" w:hAnsi="Times New Roman" w:cs="Times New Roman"/>
         </w:rPr>
+        <w:t xml:space="preserve">To enable Spring application </w:t>
+      </w:r>
+      <w:r>
+        <w:rPr>
+          <w:rFonts w:ascii="Times New Roman" w:hAnsi="Times New Roman" w:cs="Times New Roman"/>
+        </w:rPr>
+        <w:t xml:space="preserve">to </w:t>
+      </w:r>
+      <w:r>
+        <w:rPr>
+          <w:rFonts w:ascii="Times New Roman" w:hAnsi="Times New Roman" w:cs="Times New Roman"/>
+        </w:rPr>
+        <w:t xml:space="preserve">sign the authentication request, add </w:t>
+      </w:r>
+      <w:proofErr w:type="spellStart"/>
+      <w:r>
+        <w:rPr>
+          <w:rFonts w:ascii="Times New Roman" w:hAnsi="Times New Roman" w:cs="Times New Roman"/>
+        </w:rPr>
+        <w:t>WantAuthnRequestsSigned</w:t>
+      </w:r>
+      <w:proofErr w:type="spellEnd"/>
+      <w:r>
+        <w:rPr>
+          <w:rFonts w:ascii="Times New Roman" w:hAnsi="Times New Roman" w:cs="Times New Roman"/>
+        </w:rPr>
+        <w:t>="true"</w:t>
+      </w:r>
+      <w:r>
+        <w:rPr>
+          <w:rFonts w:ascii="Times New Roman" w:hAnsi="Times New Roman" w:cs="Times New Roman"/>
+        </w:rPr>
+        <w:t xml:space="preserve"> in the IdP’s metadata (</w:t>
+      </w:r>
+      <w:r>
+        <w:rPr>
+          <w:rFonts w:ascii="Times New Roman" w:hAnsi="Times New Roman" w:cs="Times New Roman"/>
+          <w:b/>
+          <w:bCs/>
+        </w:rPr>
+        <w:t>shibboleth-metadata.xml</w:t>
+      </w:r>
+      <w:r>
+        <w:rPr>
+          <w:rFonts w:ascii="Times New Roman" w:hAnsi="Times New Roman" w:cs="Times New Roman"/>
+        </w:rPr>
+        <w:t>)</w:t>
+      </w:r>
+      <w:r>
+        <w:rPr>
+          <w:rFonts w:ascii="Times New Roman" w:hAnsi="Times New Roman" w:cs="Times New Roman"/>
+        </w:rPr>
+        <w:t>:</w:t>
+      </w:r>
+    </w:p>
+    <w:p>
+      <w:pPr>
+        <w:rPr>
+          <w:rFonts w:ascii="Times New Roman" w:hAnsi="Times New Roman" w:cs="Times New Roman"/>
+        </w:rPr>
+      </w:pPr>
+      <w:r>
+        <w:rPr>
+          <w:rFonts w:ascii="Times New Roman" w:hAnsi="Times New Roman" w:cs="Times New Roman"/>
+        </w:rPr>
+        <w:drawing>
+          <wp:inline distT="0" distB="0" distL="0" distR="0" wp14:anchorId="2FA26C58" wp14:editId="05234849">
+            <wp:extent cx="5943600" cy="1252855"/>
+            <wp:effectExtent l="0" t="0" r="0" b="4445"/>
+            <wp:docPr id="1849379247" name="Picture 1"/>
+            <wp:cNvGraphicFramePr>
+              <a:graphicFrameLocks xmlns:a="http://schemas.openxmlformats.org/drawingml/2006/main" noChangeAspect="1"/>
+            </wp:cNvGraphicFramePr>
+            <a:graphic xmlns:a="http://schemas.openxmlformats.org/drawingml/2006/main">
+              <a:graphicData uri="http://schemas.openxmlformats.org/drawingml/2006/picture">
+                <pic:pic xmlns:pic="http://schemas.openxmlformats.org/drawingml/2006/picture">
+                  <pic:nvPicPr>
+                    <pic:cNvPr id="1849379247" name=""/>
+                    <pic:cNvPicPr/>
+                  </pic:nvPicPr>
+                  <pic:blipFill>
+                    <a:blip r:embed="rId11"/>
+                    <a:stretch>
+                      <a:fillRect/>
+                    </a:stretch>
+                  </pic:blipFill>
+                  <pic:spPr>
+                    <a:xfrm>
+                      <a:off x="0" y="0"/>
+                      <a:ext cx="5943600" cy="1252855"/>
+                    </a:xfrm>
+                    <a:prstGeom prst="rect">
+                      <a:avLst/>
+                    </a:prstGeom>
+                  </pic:spPr>
+                </pic:pic>
+              </a:graphicData>
+            </a:graphic>
+          </wp:inline>
+        </w:drawing>
+      </w:r>
+      <w:r>
+        <w:rPr>
+          <w:rFonts w:ascii="Times New Roman" w:hAnsi="Times New Roman" w:cs="Times New Roman"/>
+        </w:rPr>
+        <w:t xml:space="preserve"> </w:t>
+      </w:r>
+    </w:p>
+    <w:p>
+      <w:pPr>
+        <w:rPr>
+          <w:rFonts w:ascii="Times New Roman" w:hAnsi="Times New Roman" w:cs="Times New Roman"/>
+        </w:rPr>
+      </w:pPr>
+      <w:r>
+        <w:rPr>
+          <w:rFonts w:ascii="Times New Roman" w:hAnsi="Times New Roman" w:cs="Times New Roman"/>
+        </w:rPr>
+        <w:t xml:space="preserve">Type </w:t>
+      </w:r>
+      <w:hyperlink r:id="rId12" w:history="1">
+        <w:r>
+          <w:rPr>
+            <w:rStyle w:val="Hyperlink"/>
+            <w:rFonts w:ascii="Times New Roman" w:hAnsi="Times New Roman" w:cs="Times New Roman"/>
+          </w:rPr>
+          <w:t>https://localhost:9091/saml2/metadata/shibboleth</w:t>
+        </w:r>
+      </w:hyperlink>
+      <w:r>
+        <w:rPr>
+          <w:rFonts w:ascii="Times New Roman" w:hAnsi="Times New Roman" w:cs="Times New Roman"/>
+        </w:rPr>
+        <w:t xml:space="preserve"> and capture the network log.  If the redirect strings contain “</w:t>
+      </w:r>
+      <w:proofErr w:type="spellStart"/>
+      <w:r>
+        <w:rPr>
+          <w:rFonts w:ascii="Times New Roman" w:hAnsi="Times New Roman" w:cs="Times New Roman"/>
+        </w:rPr>
+        <w:t>SigAlg</w:t>
+      </w:r>
+      <w:proofErr w:type="spellEnd"/>
+      <w:r>
+        <w:rPr>
+          <w:rFonts w:ascii="Times New Roman" w:hAnsi="Times New Roman" w:cs="Times New Roman"/>
+        </w:rPr>
+        <w:t>”</w:t>
+      </w:r>
+      <w:r>
+        <w:rPr>
+          <w:rFonts w:ascii="Times New Roman" w:hAnsi="Times New Roman" w:cs="Times New Roman"/>
+        </w:rPr>
+        <w:t xml:space="preserve"> and </w:t>
+      </w:r>
+      <w:r>
+        <w:rPr>
+          <w:rFonts w:ascii="Times New Roman" w:hAnsi="Times New Roman" w:cs="Times New Roman"/>
+        </w:rPr>
+        <w:t>“</w:t>
+      </w:r>
+      <w:r>
+        <w:rPr>
+          <w:rFonts w:ascii="Times New Roman" w:hAnsi="Times New Roman" w:cs="Times New Roman"/>
+        </w:rPr>
+        <w:t>Signature</w:t>
+      </w:r>
+      <w:r>
+        <w:rPr>
+          <w:rFonts w:ascii="Times New Roman" w:hAnsi="Times New Roman" w:cs="Times New Roman"/>
+        </w:rPr>
+        <w:t xml:space="preserve">”, it means request is signed.  </w:t>
+      </w:r>
+    </w:p>
+    <w:p>
+      <w:pPr>
+        <w:rPr>
+          <w:rFonts w:ascii="Times New Roman" w:hAnsi="Times New Roman" w:cs="Times New Roman"/>
+        </w:rPr>
+      </w:pPr>
+      <w:r>
+        <w:rPr>
+          <w:rFonts w:ascii="Times New Roman" w:hAnsi="Times New Roman" w:cs="Times New Roman"/>
+        </w:rPr>
+        <w:t>For example:</w:t>
+      </w:r>
+    </w:p>
+    <w:p>
+      <w:pPr>
+        <w:rPr>
+          <w:rFonts w:ascii="Times New Roman" w:hAnsi="Times New Roman" w:cs="Times New Roman"/>
+        </w:rPr>
+      </w:pPr>
+      <w:r>
+        <w:rPr>
+          <w:rFonts w:ascii="Times New Roman" w:hAnsi="Times New Roman" w:cs="Times New Roman"/>
+        </w:rPr>
+        <w:t>https://localhost:8443/idp/profile/SAML2/Redirect/SSO?SAMLRequest=fVLLTsMwEPwVa%2B%2Bp3dRQajVFAYRAAlGawIFL5SQbYim1g9ep%2BHxCHzyExHG1MzvjGc%2FP3zct26In42wC45EAhrZ0lbGvCTzl19EZnC%2FmpDdt3Km0D41d4VuPFNhAtKT2mwR6b5XTZEhZvUFSoVRZen%2Bn4pFQnXfBla4FlhKhD4PUpbPUb9Bn6LemxKfVXQJNCB0pzltX6rZxFNRMzMbD%2BGos3%2BlwIsepMUXhWgwNsKvBiLE67Mz%2F5Z9JOeGm6vjgoDYt8k9LMV9hZTyWgWfZA7Br50vcvSyBWreEwG6vEkhXjxNZn%2BgKIymKKpJ4IiIt5TSq60qg0GIq42LA0lITmS1%2Bs4l6vLUUtA0JxCI%2BjcQsmog8jpWUSk5HQs5egC0PsVwYu4%2F7vwyLPYjUTZ4vo%2BVDlgN7PtY2AOBQktqp%2B5%2Ft%2FH9YHyuBRdb5QeLCubDOvkJefyLXadeN5%2FynwuIw%2Fv4Viw8%3D&amp;RelayState=a717d3f8-5532-4e12-8ad6-505293c0f883&amp;</w:t>
+      </w:r>
+      <w:r>
+        <w:rPr>
+          <w:rFonts w:ascii="Times New Roman" w:hAnsi="Times New Roman" w:cs="Times New Roman"/>
+          <w:b/>
+          <w:bCs/>
+        </w:rPr>
+        <w:t>SigAlg</w:t>
+      </w:r>
+      <w:r>
+        <w:rPr>
+          <w:rFonts w:ascii="Times New Roman" w:hAnsi="Times New Roman" w:cs="Times New Roman"/>
+        </w:rPr>
+        <w:t>=http%3A%2F%2Fwww.w3.org%2F2001%2F04%2Fxmldsig-more%23rsa-sha256&amp;</w:t>
+      </w:r>
+      <w:r>
+        <w:rPr>
+          <w:rFonts w:ascii="Times New Roman" w:hAnsi="Times New Roman" w:cs="Times New Roman"/>
+          <w:b/>
+          <w:bCs/>
+        </w:rPr>
+        <w:t>Signature</w:t>
+      </w:r>
+      <w:r>
+        <w:rPr>
+          <w:rFonts w:ascii="Times New Roman" w:hAnsi="Times New Roman" w:cs="Times New Roman"/>
+        </w:rPr>
+        <w:t>=ESqhyVfgqPB7Z1L%2FZE9LvYthHERyEeAPZ%2BHNkALSbzCyRr7%2FSuRvZAU%2FD994PYAanMl4eO3e6kgGXj6WLBcZwR2DBlpHydkcYtk6IGdXokgaBlDgowFOahOUCKsM6MaXmM7Fydrr5IHxAH%2BDIXWjewxUx2FbTxe3UvWqlCflTu%2BlxHwKi</w:t>
+      </w:r>
+      <w:r>
+        <w:rPr>
+          <w:rFonts w:ascii="Times New Roman" w:hAnsi="Times New Roman" w:cs="Times New Roman"/>
+        </w:rPr>
+        <w:lastRenderedPageBreak/>
+        <w:t>QbSIGfCnkpfUMsbJpsrz0nju9DH2FU4NmSxBbHDzs4jD3CoQedhrwTqK9JWvMKTbtH579HRa3AVSFTQdoWn61g8dMB%2FAo6Z3MXa%2Fp%2BrM956gf4zb3pwjmxRjB3hhLH2Be%2FcHOauIZiZOzF6FVRsOvbluzDU27ESwVTTHA%3D%3D</w:t>
+      </w:r>
+    </w:p>
+    <w:p>
+      <w:pPr>
+        <w:rPr>
+          <w:rFonts w:ascii="Times New Roman" w:hAnsi="Times New Roman" w:cs="Times New Roman"/>
+        </w:rPr>
+      </w:pPr>
+    </w:p>
+    <w:p>
+      <w:pPr>
+        <w:rPr>
+          <w:rFonts w:ascii="Times New Roman" w:hAnsi="Times New Roman" w:cs="Times New Roman"/>
+        </w:rPr>
+      </w:pPr>
+      <w:r>
+        <w:rPr>
+          <w:rFonts w:ascii="Times New Roman" w:hAnsi="Times New Roman" w:cs="Times New Roman"/>
+        </w:rPr>
         <w:t xml:space="preserve">In </w:t>
       </w:r>
       <w:r>
@@ -2057,7 +2809,7 @@
                     <pic:cNvPicPr/>
                   </pic:nvPicPr>
                   <pic:blipFill>
-                    <a:blip r:embed="rId10"/>
+                    <a:blip r:embed="rId13"/>
                     <a:stretch>
                       <a:fillRect/>
                     </a:stretch>
@@ -2105,7 +2857,7 @@
                     <pic:cNvPicPr/>
                   </pic:nvPicPr>
                   <pic:blipFill>
-                    <a:blip r:embed="rId11"/>
+                    <a:blip r:embed="rId14"/>
                     <a:stretch>
                       <a:fillRect/>
                     </a:stretch>
@@ -2171,8 +2923,8 @@
       <w:r>
         <w:rPr>
           <w:rFonts w:ascii="Times New Roman" w:hAnsi="Times New Roman" w:cs="Times New Roman"/>
-        </w:rPr>
-        <w:lastRenderedPageBreak/>
+          <w:noProof/>
+        </w:rPr>
         <w:drawing>
           <wp:inline distT="0" distB="0" distL="0" distR="0" wp14:anchorId="756043BB" wp14:editId="45D70498">
             <wp:extent cx="5943600" cy="2402840"/>
@@ -2189,7 +2941,7 @@
                     <pic:cNvPicPr/>
                   </pic:nvPicPr>
                   <pic:blipFill>
-                    <a:blip r:embed="rId12"/>
+                    <a:blip r:embed="rId15"/>
                     <a:stretch>
                       <a:fillRect/>
                     </a:stretch>
@@ -2249,6 +3001,7 @@
           <w:rFonts w:ascii="Times New Roman" w:hAnsi="Times New Roman" w:cs="Times New Roman"/>
           <w:noProof/>
         </w:rPr>
+        <w:lastRenderedPageBreak/>
         <w:drawing>
           <wp:inline distT="0" distB="0" distL="0" distR="0" wp14:anchorId="3FFE8D28" wp14:editId="7328E794">
             <wp:extent cx="5943600" cy="2281555"/>
@@ -2265,7 +3018,7 @@
                     <pic:cNvPicPr/>
                   </pic:nvPicPr>
                   <pic:blipFill>
-                    <a:blip r:embed="rId13"/>
+                    <a:blip r:embed="rId16"/>
                     <a:stretch>
                       <a:fillRect/>
                     </a:stretch>
@@ -2305,7 +3058,7 @@
         </w:rPr>
         <w:t xml:space="preserve">Create 2 such Spring Boot applications.  Make one is running at </w:t>
       </w:r>
-      <w:hyperlink r:id="rId14" w:history="1">
+      <w:hyperlink r:id="rId17" w:history="1">
         <w:r>
           <w:rPr>
             <w:rStyle w:val="Hyperlink"/>
@@ -2320,7 +3073,7 @@
         </w:rPr>
         <w:t xml:space="preserve"> and another is running at </w:t>
       </w:r>
-      <w:hyperlink r:id="rId15" w:history="1">
+      <w:hyperlink r:id="rId18" w:history="1">
         <w:r>
           <w:rPr>
             <w:rStyle w:val="Hyperlink"/>
@@ -2361,7 +3114,7 @@
         </w:rPr>
         <w:t xml:space="preserve"> SP metadata at </w:t>
       </w:r>
-      <w:hyperlink r:id="rId16" w:history="1">
+      <w:hyperlink r:id="rId19" w:history="1">
         <w:r>
           <w:rPr>
             <w:rStyle w:val="Hyperlink"/>
@@ -2403,7 +3156,7 @@
         </w:rPr>
         <w:t xml:space="preserve"> Obtain 2nd SP metadata at </w:t>
       </w:r>
-      <w:hyperlink r:id="rId17" w:history="1">
+      <w:hyperlink r:id="rId20" w:history="1">
         <w:r>
           <w:rPr>
             <w:rStyle w:val="Hyperlink"/>
@@ -2490,174 +3243,166 @@
         <w:rPr>
           <w:rFonts w:ascii="Times New Roman" w:hAnsi="Times New Roman" w:cs="Times New Roman"/>
         </w:rPr>
+        <w:t>Save the Spring metadata in Shibboleth</w:t>
+      </w:r>
+      <w:r>
+        <w:rPr>
+          <w:rFonts w:ascii="Times New Roman" w:hAnsi="Times New Roman" w:cs="Times New Roman"/>
+        </w:rPr>
+        <w:t>:</w:t>
+      </w:r>
+    </w:p>
+    <w:p>
+      <w:pPr>
+        <w:rPr>
+          <w:rFonts w:ascii="Times New Roman" w:hAnsi="Times New Roman" w:cs="Times New Roman"/>
+        </w:rPr>
+      </w:pPr>
+      <w:r>
+        <w:rPr>
+          <w:rFonts w:ascii="Times New Roman" w:hAnsi="Times New Roman" w:cs="Times New Roman"/>
+        </w:rPr>
+        <w:t xml:space="preserve">Copy SP metadata files </w:t>
+      </w:r>
+      <w:r>
+        <w:rPr>
+          <w:rFonts w:ascii="Times New Roman" w:hAnsi="Times New Roman" w:cs="Times New Roman"/>
+          <w:b/>
+          <w:bCs/>
+        </w:rPr>
+        <w:t>springboot-sp-metadata1.xml</w:t>
+      </w:r>
+      <w:r>
+        <w:rPr>
+          <w:rFonts w:ascii="Times New Roman" w:hAnsi="Times New Roman" w:cs="Times New Roman"/>
+        </w:rPr>
+        <w:t xml:space="preserve">  and </w:t>
+      </w:r>
+      <w:r>
+        <w:rPr>
+          <w:rFonts w:ascii="Times New Roman" w:hAnsi="Times New Roman" w:cs="Times New Roman"/>
+          <w:b/>
+          <w:bCs/>
+        </w:rPr>
+        <w:t>springboot-sp-metadata2.xml</w:t>
+      </w:r>
+      <w:r>
+        <w:rPr>
+          <w:rFonts w:ascii="Times New Roman" w:hAnsi="Times New Roman" w:cs="Times New Roman"/>
+        </w:rPr>
+        <w:t xml:space="preserve"> under </w:t>
+      </w:r>
+      <w:r>
+        <w:rPr>
+          <w:rFonts w:ascii="Times New Roman" w:hAnsi="Times New Roman" w:cs="Times New Roman"/>
+          <w:b/>
+          <w:bCs/>
+        </w:rPr>
+        <w:t>%PROJECT_HOME%/shibboleth-</w:t>
+      </w:r>
+      <w:proofErr w:type="spellStart"/>
+      <w:r>
+        <w:rPr>
+          <w:rFonts w:ascii="Times New Roman" w:hAnsi="Times New Roman" w:cs="Times New Roman"/>
+          <w:b/>
+          <w:bCs/>
+        </w:rPr>
+        <w:t>idp</w:t>
+      </w:r>
+      <w:proofErr w:type="spellEnd"/>
+      <w:r>
+        <w:rPr>
+          <w:rFonts w:ascii="Times New Roman" w:hAnsi="Times New Roman" w:cs="Times New Roman"/>
+          <w:b/>
+          <w:bCs/>
+        </w:rPr>
+        <w:t>/metadata</w:t>
+      </w:r>
+      <w:r>
+        <w:rPr>
+          <w:rFonts w:ascii="Times New Roman" w:hAnsi="Times New Roman" w:cs="Times New Roman"/>
+        </w:rPr>
+        <w:t>.</w:t>
+      </w:r>
+    </w:p>
+    <w:p>
+      <w:pPr>
+        <w:rPr>
+          <w:rFonts w:ascii="Times New Roman" w:hAnsi="Times New Roman" w:cs="Times New Roman"/>
+        </w:rPr>
+      </w:pPr>
+    </w:p>
+    <w:p>
+      <w:pPr>
+        <w:rPr>
+          <w:rFonts w:ascii="Times New Roman" w:hAnsi="Times New Roman" w:cs="Times New Roman"/>
+          <w:b/>
+          <w:bCs/>
+        </w:rPr>
+      </w:pPr>
+      <w:r>
+        <w:rPr>
+          <w:rFonts w:ascii="Times New Roman" w:hAnsi="Times New Roman" w:cs="Times New Roman"/>
+        </w:rPr>
+        <w:t>Tell Shibboleth about Spring Boot</w:t>
+      </w:r>
+      <w:r>
+        <w:rPr>
+          <w:rFonts w:ascii="Times New Roman" w:hAnsi="Times New Roman" w:cs="Times New Roman"/>
+        </w:rPr>
+        <w:t xml:space="preserve"> </w:t>
+      </w:r>
+      <w:r>
+        <w:rPr>
+          <w:rFonts w:ascii="Times New Roman" w:hAnsi="Times New Roman" w:cs="Times New Roman"/>
+        </w:rPr>
+        <w:t xml:space="preserve">applications’ metadata </w:t>
+      </w:r>
+      <w:r>
+        <w:rPr>
+          <w:rFonts w:ascii="Times New Roman" w:hAnsi="Times New Roman" w:cs="Times New Roman"/>
+        </w:rPr>
+        <w:t xml:space="preserve">by editing </w:t>
+      </w:r>
+      <w:r>
+        <w:rPr>
+          <w:rFonts w:ascii="Times New Roman" w:hAnsi="Times New Roman" w:cs="Times New Roman"/>
+          <w:b/>
+          <w:bCs/>
+        </w:rPr>
+        <w:t>%PROJECT_HOME%/shibboleth-</w:t>
+      </w:r>
+      <w:proofErr w:type="spellStart"/>
+      <w:r>
+        <w:rPr>
+          <w:rFonts w:ascii="Times New Roman" w:hAnsi="Times New Roman" w:cs="Times New Roman"/>
+          <w:b/>
+          <w:bCs/>
+        </w:rPr>
+        <w:t>idp</w:t>
+      </w:r>
+      <w:proofErr w:type="spellEnd"/>
+      <w:r>
+        <w:rPr>
+          <w:rFonts w:ascii="Times New Roman" w:hAnsi="Times New Roman" w:cs="Times New Roman"/>
+          <w:b/>
+          <w:bCs/>
+        </w:rPr>
+        <w:t>/conf/metadata-providers.xml:</w:t>
+      </w:r>
+    </w:p>
+    <w:p>
+      <w:pPr>
+        <w:rPr>
+          <w:rFonts w:ascii="Times New Roman" w:hAnsi="Times New Roman" w:cs="Times New Roman"/>
+        </w:rPr>
+      </w:pPr>
+      <w:r>
+        <w:rPr>
+          <w:rFonts w:ascii="Times New Roman" w:hAnsi="Times New Roman" w:cs="Times New Roman"/>
+          <w:noProof/>
+        </w:rPr>
         <w:lastRenderedPageBreak/>
-        <w:t>Save the Spring metadata in Shibboleth</w:t>
-      </w:r>
-      <w:r>
-        <w:rPr>
-          <w:rFonts w:ascii="Times New Roman" w:hAnsi="Times New Roman" w:cs="Times New Roman"/>
-        </w:rPr>
-        <w:t>:</w:t>
-      </w:r>
-    </w:p>
-    <w:p>
-      <w:pPr>
-        <w:rPr>
-          <w:rFonts w:ascii="Times New Roman" w:hAnsi="Times New Roman" w:cs="Times New Roman"/>
-        </w:rPr>
-      </w:pPr>
-      <w:r>
-        <w:rPr>
-          <w:rFonts w:ascii="Times New Roman" w:hAnsi="Times New Roman" w:cs="Times New Roman"/>
-        </w:rPr>
-        <w:t xml:space="preserve">Copy SP metadata files </w:t>
-      </w:r>
-      <w:proofErr w:type="gramStart"/>
-      <w:r>
-        <w:rPr>
-          <w:rFonts w:ascii="Times New Roman" w:hAnsi="Times New Roman" w:cs="Times New Roman"/>
-          <w:b/>
-          <w:bCs/>
-        </w:rPr>
-        <w:t>springboot-sp-metadata1.xml</w:t>
-      </w:r>
-      <w:r>
-        <w:rPr>
-          <w:rFonts w:ascii="Times New Roman" w:hAnsi="Times New Roman" w:cs="Times New Roman"/>
-        </w:rPr>
-        <w:t xml:space="preserve">  and</w:t>
-      </w:r>
-      <w:proofErr w:type="gramEnd"/>
-      <w:r>
-        <w:rPr>
-          <w:rFonts w:ascii="Times New Roman" w:hAnsi="Times New Roman" w:cs="Times New Roman"/>
-        </w:rPr>
-        <w:t xml:space="preserve"> </w:t>
-      </w:r>
-      <w:r>
-        <w:rPr>
-          <w:rFonts w:ascii="Times New Roman" w:hAnsi="Times New Roman" w:cs="Times New Roman"/>
-          <w:b/>
-          <w:bCs/>
-        </w:rPr>
-        <w:t>springboot-sp-metadata2.xml</w:t>
-      </w:r>
-      <w:r>
-        <w:rPr>
-          <w:rFonts w:ascii="Times New Roman" w:hAnsi="Times New Roman" w:cs="Times New Roman"/>
-        </w:rPr>
-        <w:t xml:space="preserve"> under </w:t>
-      </w:r>
-      <w:r>
-        <w:rPr>
-          <w:rFonts w:ascii="Times New Roman" w:hAnsi="Times New Roman" w:cs="Times New Roman"/>
-          <w:b/>
-          <w:bCs/>
-        </w:rPr>
-        <w:t>%PROJECT_HOME%/shibboleth-</w:t>
-      </w:r>
-      <w:proofErr w:type="spellStart"/>
-      <w:r>
-        <w:rPr>
-          <w:rFonts w:ascii="Times New Roman" w:hAnsi="Times New Roman" w:cs="Times New Roman"/>
-          <w:b/>
-          <w:bCs/>
-        </w:rPr>
-        <w:t>idp</w:t>
-      </w:r>
-      <w:proofErr w:type="spellEnd"/>
-      <w:r>
-        <w:rPr>
-          <w:rFonts w:ascii="Times New Roman" w:hAnsi="Times New Roman" w:cs="Times New Roman"/>
-          <w:b/>
-          <w:bCs/>
-        </w:rPr>
-        <w:t>/metadata</w:t>
-      </w:r>
-      <w:r>
-        <w:rPr>
-          <w:rFonts w:ascii="Times New Roman" w:hAnsi="Times New Roman" w:cs="Times New Roman"/>
-        </w:rPr>
-        <w:t>.</w:t>
-      </w:r>
-    </w:p>
-    <w:p>
-      <w:pPr>
-        <w:rPr>
-          <w:rFonts w:ascii="Times New Roman" w:hAnsi="Times New Roman" w:cs="Times New Roman"/>
-        </w:rPr>
-      </w:pPr>
-    </w:p>
-    <w:p>
-      <w:pPr>
-        <w:rPr>
-          <w:rFonts w:ascii="Times New Roman" w:hAnsi="Times New Roman" w:cs="Times New Roman"/>
-          <w:b/>
-          <w:bCs/>
-        </w:rPr>
-      </w:pPr>
-      <w:r>
-        <w:rPr>
-          <w:rFonts w:ascii="Times New Roman" w:hAnsi="Times New Roman" w:cs="Times New Roman"/>
-        </w:rPr>
-        <w:t>Tell Shibboleth about Spring Boot</w:t>
-      </w:r>
-      <w:r>
-        <w:rPr>
-          <w:rFonts w:ascii="Times New Roman" w:hAnsi="Times New Roman" w:cs="Times New Roman"/>
-        </w:rPr>
-        <w:t xml:space="preserve"> </w:t>
-      </w:r>
-      <w:r>
-        <w:rPr>
-          <w:rFonts w:ascii="Times New Roman" w:hAnsi="Times New Roman" w:cs="Times New Roman"/>
-        </w:rPr>
-        <w:t xml:space="preserve">applications’ metadata </w:t>
-      </w:r>
-      <w:r>
-        <w:rPr>
-          <w:rFonts w:ascii="Times New Roman" w:hAnsi="Times New Roman" w:cs="Times New Roman"/>
-        </w:rPr>
-        <w:t xml:space="preserve">by editing </w:t>
-      </w:r>
-      <w:r>
-        <w:rPr>
-          <w:rFonts w:ascii="Times New Roman" w:hAnsi="Times New Roman" w:cs="Times New Roman"/>
-          <w:b/>
-          <w:bCs/>
-        </w:rPr>
-        <w:t>%PROJECT_HOME%/shibboleth-</w:t>
-      </w:r>
-      <w:proofErr w:type="spellStart"/>
-      <w:r>
-        <w:rPr>
-          <w:rFonts w:ascii="Times New Roman" w:hAnsi="Times New Roman" w:cs="Times New Roman"/>
-          <w:b/>
-          <w:bCs/>
-        </w:rPr>
-        <w:t>idp</w:t>
-      </w:r>
-      <w:proofErr w:type="spellEnd"/>
-      <w:r>
-        <w:rPr>
-          <w:rFonts w:ascii="Times New Roman" w:hAnsi="Times New Roman" w:cs="Times New Roman"/>
-          <w:b/>
-          <w:bCs/>
-        </w:rPr>
-        <w:t>/conf/metadata-providers.xml:</w:t>
-      </w:r>
-    </w:p>
-    <w:p>
-      <w:pPr>
-        <w:rPr>
-          <w:rFonts w:ascii="Times New Roman" w:hAnsi="Times New Roman" w:cs="Times New Roman"/>
-        </w:rPr>
-      </w:pPr>
-      <w:r>
-        <w:rPr>
-          <w:rFonts w:ascii="Times New Roman" w:hAnsi="Times New Roman" w:cs="Times New Roman"/>
-          <w:noProof/>
-        </w:rPr>
         <w:drawing>
           <wp:inline distT="0" distB="0" distL="0" distR="0" wp14:anchorId="464A5671" wp14:editId="0514275E">
             <wp:extent cx="5943600" cy="2799080"/>
@@ -2674,7 +3419,7 @@
                     <pic:cNvPicPr/>
                   </pic:nvPicPr>
                   <pic:blipFill>
-                    <a:blip r:embed="rId18"/>
+                    <a:blip r:embed="rId21"/>
                     <a:stretch>
                       <a:fillRect/>
                     </a:stretch>
@@ -2789,23 +3534,13 @@
         <w:t xml:space="preserve">bin\module.bat -t </w:t>
       </w:r>
       <w:proofErr w:type="spellStart"/>
-      <w:proofErr w:type="gramStart"/>
-      <w:r>
-        <w:rPr>
-          <w:rFonts w:ascii="Times New Roman" w:hAnsi="Times New Roman" w:cs="Times New Roman"/>
-          <w:b/>
-          <w:bCs/>
-        </w:rPr>
-        <w:t>idp.authn</w:t>
-      </w:r>
-      <w:proofErr w:type="gramEnd"/>
-      <w:r>
-        <w:rPr>
-          <w:rFonts w:ascii="Times New Roman" w:hAnsi="Times New Roman" w:cs="Times New Roman"/>
-          <w:b/>
-          <w:bCs/>
-        </w:rPr>
-        <w:t>.Password</w:t>
+      <w:r>
+        <w:rPr>
+          <w:rFonts w:ascii="Times New Roman" w:hAnsi="Times New Roman" w:cs="Times New Roman"/>
+          <w:b/>
+          <w:bCs/>
+        </w:rPr>
+        <w:t>idp.authn.Password</w:t>
       </w:r>
       <w:proofErr w:type="spellEnd"/>
     </w:p>
@@ -2839,23 +3574,13 @@
         <w:t xml:space="preserve">&gt; bin\module.bat -e </w:t>
       </w:r>
       <w:proofErr w:type="spellStart"/>
-      <w:proofErr w:type="gramStart"/>
-      <w:r>
-        <w:rPr>
-          <w:rFonts w:ascii="Times New Roman" w:hAnsi="Times New Roman" w:cs="Times New Roman"/>
-          <w:b/>
-          <w:bCs/>
-        </w:rPr>
-        <w:t>idp.authn</w:t>
-      </w:r>
-      <w:proofErr w:type="gramEnd"/>
-      <w:r>
-        <w:rPr>
-          <w:rFonts w:ascii="Times New Roman" w:hAnsi="Times New Roman" w:cs="Times New Roman"/>
-          <w:b/>
-          <w:bCs/>
-        </w:rPr>
-        <w:t>.Password</w:t>
+      <w:r>
+        <w:rPr>
+          <w:rFonts w:ascii="Times New Roman" w:hAnsi="Times New Roman" w:cs="Times New Roman"/>
+          <w:b/>
+          <w:bCs/>
+        </w:rPr>
+        <w:t>idp.authn.Password</w:t>
       </w:r>
       <w:proofErr w:type="spellEnd"/>
     </w:p>
@@ -3100,7 +3825,6 @@
         <w:t xml:space="preserve">contains </w:t>
       </w:r>
       <w:proofErr w:type="spellStart"/>
-      <w:proofErr w:type="gramStart"/>
       <w:r>
         <w:rPr>
           <w:rFonts w:ascii="Times New Roman" w:hAnsi="Times New Roman" w:cs="Times New Roman"/>
@@ -3108,7 +3832,6 @@
         <w:t>username:encrypted</w:t>
       </w:r>
       <w:proofErr w:type="spellEnd"/>
-      <w:proofErr w:type="gramEnd"/>
       <w:r>
         <w:rPr>
           <w:rFonts w:ascii="Times New Roman" w:hAnsi="Times New Roman" w:cs="Times New Roman"/>
@@ -3156,244 +3879,206 @@
           <w:b/>
           <w:bCs/>
         </w:rPr>
+        <w:t xml:space="preserve">&gt; </w:t>
+      </w:r>
+      <w:proofErr w:type="spellStart"/>
+      <w:r>
+        <w:rPr>
+          <w:rFonts w:ascii="Times New Roman" w:hAnsi="Times New Roman" w:cs="Times New Roman"/>
+          <w:b/>
+          <w:bCs/>
+        </w:rPr>
+        <w:t>htpasswd</w:t>
+      </w:r>
+      <w:proofErr w:type="spellEnd"/>
+      <w:r>
+        <w:rPr>
+          <w:rFonts w:ascii="Times New Roman" w:hAnsi="Times New Roman" w:cs="Times New Roman"/>
+          <w:b/>
+          <w:bCs/>
+        </w:rPr>
+        <w:t xml:space="preserve"> -c </w:t>
+      </w:r>
+      <w:r>
+        <w:rPr>
+          <w:rFonts w:ascii="Times New Roman" w:hAnsi="Times New Roman" w:cs="Times New Roman"/>
+          <w:b/>
+          <w:bCs/>
+        </w:rPr>
+        <w:t>%PROJECT_HOME%</w:t>
+      </w:r>
+      <w:r>
+        <w:rPr>
+          <w:rFonts w:ascii="Times New Roman" w:hAnsi="Times New Roman" w:cs="Times New Roman"/>
+          <w:b/>
+          <w:bCs/>
+        </w:rPr>
+        <w:t>\</w:t>
+      </w:r>
+      <w:r>
+        <w:rPr>
+          <w:rFonts w:ascii="Times New Roman" w:hAnsi="Times New Roman" w:cs="Times New Roman"/>
+          <w:b/>
+          <w:bCs/>
+        </w:rPr>
+        <w:t>shibboleth-</w:t>
+      </w:r>
+      <w:proofErr w:type="spellStart"/>
+      <w:r>
+        <w:rPr>
+          <w:rFonts w:ascii="Times New Roman" w:hAnsi="Times New Roman" w:cs="Times New Roman"/>
+          <w:b/>
+          <w:bCs/>
+        </w:rPr>
+        <w:t>idp</w:t>
+      </w:r>
+      <w:proofErr w:type="spellEnd"/>
+      <w:r>
+        <w:rPr>
+          <w:rFonts w:ascii="Times New Roman" w:hAnsi="Times New Roman" w:cs="Times New Roman"/>
+          <w:b/>
+          <w:bCs/>
+        </w:rPr>
+        <w:t>\conf\</w:t>
+      </w:r>
+      <w:proofErr w:type="spellStart"/>
+      <w:r>
+        <w:rPr>
+          <w:rFonts w:ascii="Times New Roman" w:hAnsi="Times New Roman" w:cs="Times New Roman"/>
+          <w:b/>
+          <w:bCs/>
+        </w:rPr>
+        <w:t>authn</w:t>
+      </w:r>
+      <w:proofErr w:type="spellEnd"/>
+      <w:r>
+        <w:rPr>
+          <w:rFonts w:ascii="Times New Roman" w:hAnsi="Times New Roman" w:cs="Times New Roman"/>
+          <w:b/>
+          <w:bCs/>
+        </w:rPr>
+        <w:t xml:space="preserve">\htpasswd.txt </w:t>
+      </w:r>
+      <w:proofErr w:type="spellStart"/>
+      <w:r>
+        <w:rPr>
+          <w:rFonts w:ascii="Times New Roman" w:hAnsi="Times New Roman" w:cs="Times New Roman"/>
+          <w:b/>
+          <w:bCs/>
+        </w:rPr>
+        <w:t>testuser</w:t>
+      </w:r>
+      <w:proofErr w:type="spellEnd"/>
+    </w:p>
+    <w:p>
+      <w:pPr>
+        <w:rPr>
+          <w:rFonts w:ascii="Times New Roman" w:hAnsi="Times New Roman" w:cs="Times New Roman"/>
+        </w:rPr>
+      </w:pPr>
+      <w:r>
+        <w:rPr>
+          <w:rFonts w:ascii="Times New Roman" w:hAnsi="Times New Roman" w:cs="Times New Roman"/>
+        </w:rPr>
+        <w:t xml:space="preserve">Or we can use Python </w:t>
+      </w:r>
+      <w:proofErr w:type="spellStart"/>
+      <w:r>
+        <w:rPr>
+          <w:rFonts w:ascii="Times New Roman" w:hAnsi="Times New Roman" w:cs="Times New Roman"/>
+        </w:rPr>
+        <w:t>passLib</w:t>
+      </w:r>
+      <w:proofErr w:type="spellEnd"/>
+      <w:r>
+        <w:rPr>
+          <w:rFonts w:ascii="Times New Roman" w:hAnsi="Times New Roman" w:cs="Times New Roman"/>
+        </w:rPr>
+        <w:t>:</w:t>
+      </w:r>
+    </w:p>
+    <w:p>
+      <w:pPr>
+        <w:rPr>
+          <w:rFonts w:ascii="Times New Roman" w:hAnsi="Times New Roman" w:cs="Times New Roman"/>
+          <w:b/>
+          <w:bCs/>
+        </w:rPr>
+      </w:pPr>
+      <w:r>
+        <w:rPr>
+          <w:rFonts w:ascii="Times New Roman" w:hAnsi="Times New Roman" w:cs="Times New Roman"/>
+          <w:b/>
+          <w:bCs/>
+        </w:rPr>
+        <w:t xml:space="preserve">&gt; python -m pip install </w:t>
+      </w:r>
+      <w:proofErr w:type="spellStart"/>
+      <w:r>
+        <w:rPr>
+          <w:rFonts w:ascii="Times New Roman" w:hAnsi="Times New Roman" w:cs="Times New Roman"/>
+          <w:b/>
+          <w:bCs/>
+        </w:rPr>
+        <w:t>passlib</w:t>
+      </w:r>
+      <w:proofErr w:type="spellEnd"/>
+    </w:p>
+    <w:p>
+      <w:pPr>
+        <w:rPr>
+          <w:rFonts w:ascii="Times New Roman" w:hAnsi="Times New Roman" w:cs="Times New Roman"/>
+          <w:b/>
+          <w:bCs/>
+        </w:rPr>
+      </w:pPr>
+      <w:r>
+        <w:rPr>
+          <w:rFonts w:ascii="Times New Roman" w:hAnsi="Times New Roman" w:cs="Times New Roman"/>
+          <w:b/>
+          <w:bCs/>
+        </w:rPr>
+        <w:t xml:space="preserve">&gt; python -c "from </w:t>
+      </w:r>
+      <w:proofErr w:type="spellStart"/>
+      <w:r>
+        <w:rPr>
+          <w:rFonts w:ascii="Times New Roman" w:hAnsi="Times New Roman" w:cs="Times New Roman"/>
+          <w:b/>
+          <w:bCs/>
+        </w:rPr>
+        <w:t>passlib.hash</w:t>
+      </w:r>
+      <w:proofErr w:type="spellEnd"/>
+      <w:r>
+        <w:rPr>
+          <w:rFonts w:ascii="Times New Roman" w:hAnsi="Times New Roman" w:cs="Times New Roman"/>
+          <w:b/>
+          <w:bCs/>
+        </w:rPr>
+        <w:t xml:space="preserve"> import sha512_crypt;print(sha512_crypt.hash('Test123!'))"</w:t>
+      </w:r>
+    </w:p>
+    <w:p>
+      <w:pPr>
+        <w:rPr>
+          <w:rFonts w:ascii="Times New Roman" w:hAnsi="Times New Roman" w:cs="Times New Roman"/>
+        </w:rPr>
+      </w:pPr>
+    </w:p>
+    <w:p>
+      <w:pPr>
+        <w:rPr>
+          <w:rFonts w:ascii="Times New Roman" w:hAnsi="Times New Roman" w:cs="Times New Roman"/>
+          <w:b/>
+          <w:bCs/>
+        </w:rPr>
+      </w:pPr>
+      <w:r>
+        <w:rPr>
+          <w:rFonts w:ascii="Times New Roman" w:hAnsi="Times New Roman" w:cs="Times New Roman"/>
+        </w:rPr>
         <w:lastRenderedPageBreak/>
-        <w:t xml:space="preserve">&gt; </w:t>
-      </w:r>
-      <w:proofErr w:type="spellStart"/>
-      <w:r>
-        <w:rPr>
-          <w:rFonts w:ascii="Times New Roman" w:hAnsi="Times New Roman" w:cs="Times New Roman"/>
-          <w:b/>
-          <w:bCs/>
-        </w:rPr>
-        <w:t>htpasswd</w:t>
-      </w:r>
-      <w:proofErr w:type="spellEnd"/>
-      <w:r>
-        <w:rPr>
-          <w:rFonts w:ascii="Times New Roman" w:hAnsi="Times New Roman" w:cs="Times New Roman"/>
-          <w:b/>
-          <w:bCs/>
-        </w:rPr>
-        <w:t xml:space="preserve"> -c </w:t>
-      </w:r>
-      <w:r>
-        <w:rPr>
-          <w:rFonts w:ascii="Times New Roman" w:hAnsi="Times New Roman" w:cs="Times New Roman"/>
-          <w:b/>
-          <w:bCs/>
-        </w:rPr>
-        <w:t>%PROJECT_HOME%</w:t>
-      </w:r>
-      <w:r>
-        <w:rPr>
-          <w:rFonts w:ascii="Times New Roman" w:hAnsi="Times New Roman" w:cs="Times New Roman"/>
-          <w:b/>
-          <w:bCs/>
-        </w:rPr>
-        <w:t>\</w:t>
-      </w:r>
-      <w:r>
-        <w:rPr>
-          <w:rFonts w:ascii="Times New Roman" w:hAnsi="Times New Roman" w:cs="Times New Roman"/>
-          <w:b/>
-          <w:bCs/>
-        </w:rPr>
-        <w:t>shibboleth-</w:t>
-      </w:r>
-      <w:proofErr w:type="spellStart"/>
-      <w:r>
-        <w:rPr>
-          <w:rFonts w:ascii="Times New Roman" w:hAnsi="Times New Roman" w:cs="Times New Roman"/>
-          <w:b/>
-          <w:bCs/>
-        </w:rPr>
-        <w:t>idp</w:t>
-      </w:r>
-      <w:proofErr w:type="spellEnd"/>
-      <w:r>
-        <w:rPr>
-          <w:rFonts w:ascii="Times New Roman" w:hAnsi="Times New Roman" w:cs="Times New Roman"/>
-          <w:b/>
-          <w:bCs/>
-        </w:rPr>
-        <w:t>\conf\</w:t>
-      </w:r>
-      <w:proofErr w:type="spellStart"/>
-      <w:r>
-        <w:rPr>
-          <w:rFonts w:ascii="Times New Roman" w:hAnsi="Times New Roman" w:cs="Times New Roman"/>
-          <w:b/>
-          <w:bCs/>
-        </w:rPr>
-        <w:t>authn</w:t>
-      </w:r>
-      <w:proofErr w:type="spellEnd"/>
-      <w:r>
-        <w:rPr>
-          <w:rFonts w:ascii="Times New Roman" w:hAnsi="Times New Roman" w:cs="Times New Roman"/>
-          <w:b/>
-          <w:bCs/>
-        </w:rPr>
-        <w:t xml:space="preserve">\htpasswd.txt </w:t>
-      </w:r>
-      <w:proofErr w:type="spellStart"/>
-      <w:r>
-        <w:rPr>
-          <w:rFonts w:ascii="Times New Roman" w:hAnsi="Times New Roman" w:cs="Times New Roman"/>
-          <w:b/>
-          <w:bCs/>
-        </w:rPr>
-        <w:t>testuser</w:t>
-      </w:r>
-      <w:proofErr w:type="spellEnd"/>
-    </w:p>
-    <w:p>
-      <w:pPr>
-        <w:rPr>
-          <w:rFonts w:ascii="Times New Roman" w:hAnsi="Times New Roman" w:cs="Times New Roman"/>
-        </w:rPr>
-      </w:pPr>
-      <w:r>
-        <w:rPr>
-          <w:rFonts w:ascii="Times New Roman" w:hAnsi="Times New Roman" w:cs="Times New Roman"/>
-        </w:rPr>
-        <w:t xml:space="preserve">Or we can use Python </w:t>
-      </w:r>
-      <w:proofErr w:type="spellStart"/>
-      <w:r>
-        <w:rPr>
-          <w:rFonts w:ascii="Times New Roman" w:hAnsi="Times New Roman" w:cs="Times New Roman"/>
-        </w:rPr>
-        <w:t>passLib</w:t>
-      </w:r>
-      <w:proofErr w:type="spellEnd"/>
-      <w:r>
-        <w:rPr>
-          <w:rFonts w:ascii="Times New Roman" w:hAnsi="Times New Roman" w:cs="Times New Roman"/>
-        </w:rPr>
-        <w:t>:</w:t>
-      </w:r>
-    </w:p>
-    <w:p>
-      <w:pPr>
-        <w:rPr>
-          <w:rFonts w:ascii="Times New Roman" w:hAnsi="Times New Roman" w:cs="Times New Roman"/>
-          <w:b/>
-          <w:bCs/>
-        </w:rPr>
-      </w:pPr>
-      <w:r>
-        <w:rPr>
-          <w:rFonts w:ascii="Times New Roman" w:hAnsi="Times New Roman" w:cs="Times New Roman"/>
-          <w:b/>
-          <w:bCs/>
-        </w:rPr>
-        <w:t xml:space="preserve">&gt; python -m pip install </w:t>
-      </w:r>
-      <w:proofErr w:type="spellStart"/>
-      <w:r>
-        <w:rPr>
-          <w:rFonts w:ascii="Times New Roman" w:hAnsi="Times New Roman" w:cs="Times New Roman"/>
-          <w:b/>
-          <w:bCs/>
-        </w:rPr>
-        <w:t>passlib</w:t>
-      </w:r>
-      <w:proofErr w:type="spellEnd"/>
-    </w:p>
-    <w:p>
-      <w:pPr>
-        <w:rPr>
-          <w:rFonts w:ascii="Times New Roman" w:hAnsi="Times New Roman" w:cs="Times New Roman"/>
-          <w:b/>
-          <w:bCs/>
-        </w:rPr>
-      </w:pPr>
-      <w:r>
-        <w:rPr>
-          <w:rFonts w:ascii="Times New Roman" w:hAnsi="Times New Roman" w:cs="Times New Roman"/>
-          <w:b/>
-          <w:bCs/>
-        </w:rPr>
-        <w:t xml:space="preserve">&gt; python -c "from </w:t>
-      </w:r>
-      <w:proofErr w:type="spellStart"/>
-      <w:proofErr w:type="gramStart"/>
-      <w:r>
-        <w:rPr>
-          <w:rFonts w:ascii="Times New Roman" w:hAnsi="Times New Roman" w:cs="Times New Roman"/>
-          <w:b/>
-          <w:bCs/>
-        </w:rPr>
-        <w:t>passlib.hash</w:t>
-      </w:r>
-      <w:proofErr w:type="spellEnd"/>
-      <w:proofErr w:type="gramEnd"/>
-      <w:r>
-        <w:rPr>
-          <w:rFonts w:ascii="Times New Roman" w:hAnsi="Times New Roman" w:cs="Times New Roman"/>
-          <w:b/>
-          <w:bCs/>
-        </w:rPr>
-        <w:t xml:space="preserve"> import sha512_</w:t>
-      </w:r>
-      <w:proofErr w:type="gramStart"/>
-      <w:r>
-        <w:rPr>
-          <w:rFonts w:ascii="Times New Roman" w:hAnsi="Times New Roman" w:cs="Times New Roman"/>
-          <w:b/>
-          <w:bCs/>
-        </w:rPr>
-        <w:t>crypt;print</w:t>
-      </w:r>
-      <w:proofErr w:type="gramEnd"/>
-      <w:r>
-        <w:rPr>
-          <w:rFonts w:ascii="Times New Roman" w:hAnsi="Times New Roman" w:cs="Times New Roman"/>
-          <w:b/>
-          <w:bCs/>
-        </w:rPr>
-        <w:t>(sha512_</w:t>
-      </w:r>
-      <w:proofErr w:type="gramStart"/>
-      <w:r>
-        <w:rPr>
-          <w:rFonts w:ascii="Times New Roman" w:hAnsi="Times New Roman" w:cs="Times New Roman"/>
-          <w:b/>
-          <w:bCs/>
-        </w:rPr>
-        <w:t>crypt.hash</w:t>
-      </w:r>
-      <w:proofErr w:type="gramEnd"/>
-      <w:r>
-        <w:rPr>
-          <w:rFonts w:ascii="Times New Roman" w:hAnsi="Times New Roman" w:cs="Times New Roman"/>
-          <w:b/>
-          <w:bCs/>
-        </w:rPr>
-        <w:t>('Test123!'))"</w:t>
-      </w:r>
-    </w:p>
-    <w:p>
-      <w:pPr>
-        <w:rPr>
-          <w:rFonts w:ascii="Times New Roman" w:hAnsi="Times New Roman" w:cs="Times New Roman"/>
-        </w:rPr>
-      </w:pPr>
-    </w:p>
-    <w:p>
-      <w:pPr>
-        <w:rPr>
-          <w:rFonts w:ascii="Times New Roman" w:hAnsi="Times New Roman" w:cs="Times New Roman"/>
-          <w:b/>
-          <w:bCs/>
-        </w:rPr>
-      </w:pPr>
-      <w:r>
-        <w:rPr>
-          <w:rFonts w:ascii="Times New Roman" w:hAnsi="Times New Roman" w:cs="Times New Roman"/>
-        </w:rPr>
         <w:t xml:space="preserve">Register the </w:t>
       </w:r>
       <w:r>
@@ -3478,7 +4163,7 @@
                     <pic:cNvPicPr/>
                   </pic:nvPicPr>
                   <pic:blipFill>
-                    <a:blip r:embed="rId19"/>
+                    <a:blip r:embed="rId22"/>
                     <a:stretch>
                       <a:fillRect/>
                     </a:stretch>
@@ -3590,7 +4275,7 @@
                     <pic:cNvPicPr/>
                   </pic:nvPicPr>
                   <pic:blipFill>
-                    <a:blip r:embed="rId20"/>
+                    <a:blip r:embed="rId23"/>
                     <a:stretch>
                       <a:fillRect/>
                     </a:stretch>
@@ -3672,7 +4357,7 @@
                     <pic:cNvPicPr/>
                   </pic:nvPicPr>
                   <pic:blipFill>
-                    <a:blip r:embed="rId21"/>
+                    <a:blip r:embed="rId24"/>
                     <a:stretch>
                       <a:fillRect/>
                     </a:stretch>
@@ -3776,12 +4461,21 @@
       <w:pPr>
         <w:rPr>
           <w:rFonts w:ascii="Times New Roman" w:hAnsi="Times New Roman" w:cs="Times New Roman"/>
-          <w:b/>
-          <w:bCs/>
-          <w:sz w:val="28"/>
-          <w:szCs w:val="28"/>
-        </w:rPr>
-      </w:pPr>
+        </w:rPr>
+      </w:pPr>
+    </w:p>
+    <w:p>
+      <w:pPr>
+        <w:rPr>
+          <w:rFonts w:ascii="Times New Roman" w:hAnsi="Times New Roman" w:cs="Times New Roman"/>
+        </w:rPr>
+      </w:pPr>
+      <w:r>
+        <w:rPr>
+          <w:rFonts w:ascii="Times New Roman" w:hAnsi="Times New Roman" w:cs="Times New Roman"/>
+        </w:rPr>
+        <w:t>Open Chrome Incognito browser.</w:t>
+      </w:r>
     </w:p>
     <w:p>
       <w:pPr>
@@ -3795,7 +4489,7 @@
         </w:rPr>
         <w:t xml:space="preserve">Access Spring application 1 URL, </w:t>
       </w:r>
-      <w:hyperlink r:id="rId22" w:history="1">
+      <w:hyperlink r:id="rId25" w:history="1">
         <w:r>
           <w:rPr>
             <w:rStyle w:val="Hyperlink"/>
@@ -3839,7 +4533,7 @@
                     <pic:cNvPicPr/>
                   </pic:nvPicPr>
                   <pic:blipFill>
-                    <a:blip r:embed="rId23"/>
+                    <a:blip r:embed="rId26"/>
                     <a:stretch>
                       <a:fillRect/>
                     </a:stretch>
@@ -3907,7 +4601,7 @@
                     <pic:cNvPicPr/>
                   </pic:nvPicPr>
                   <pic:blipFill>
-                    <a:blip r:embed="rId24"/>
+                    <a:blip r:embed="rId27"/>
                     <a:stretch>
                       <a:fillRect/>
                     </a:stretch>
@@ -3941,7 +4635,7 @@
         <w:lastRenderedPageBreak/>
         <w:t xml:space="preserve">Access Spring application 2 URL, </w:t>
       </w:r>
-      <w:hyperlink r:id="rId25" w:history="1">
+      <w:hyperlink r:id="rId28" w:history="1">
         <w:r>
           <w:rPr>
             <w:rStyle w:val="Hyperlink"/>
@@ -3984,7 +4678,7 @@
                     <pic:cNvPicPr/>
                   </pic:nvPicPr>
                   <pic:blipFill>
-                    <a:blip r:embed="rId26"/>
+                    <a:blip r:embed="rId29"/>
                     <a:stretch>
                       <a:fillRect/>
                     </a:stretch>

</xml_diff>

<commit_message>
Updated doc and added scripts
</commit_message>
<xml_diff>
--- a/docs/Configure Shibboleth SAML for Spring Boot Applications More Secure.docx
+++ b/docs/Configure Shibboleth SAML for Spring Boot Applications More Secure.docx
@@ -154,7 +154,19 @@
         <w:rPr>
           <w:rFonts w:ascii="Times New Roman" w:hAnsi="Times New Roman" w:cs="Times New Roman"/>
         </w:rPr>
-        <w:t xml:space="preserve"> Open a CMD window with admin rights.  Set </w:t>
+        <w:t xml:space="preserve"> Open a </w:t>
+      </w:r>
+      <w:r>
+        <w:rPr>
+          <w:rFonts w:ascii="Times New Roman" w:hAnsi="Times New Roman" w:cs="Times New Roman"/>
+        </w:rPr>
+        <w:t>command line</w:t>
+      </w:r>
+      <w:r>
+        <w:rPr>
+          <w:rFonts w:ascii="Times New Roman" w:hAnsi="Times New Roman" w:cs="Times New Roman"/>
+        </w:rPr>
+        <w:t xml:space="preserve"> window with admin rights.  Set </w:t>
       </w:r>
       <w:r>
         <w:rPr>
@@ -375,8 +387,18 @@
           <w:b/>
           <w:bCs/>
         </w:rPr>
-        <w:t>%PROJECT_HOME%/shibboleth-idp</w:t>
-      </w:r>
+        <w:t>%PROJECT_HOME%/shibboleth-</w:t>
+      </w:r>
+      <w:proofErr w:type="spellStart"/>
+      <w:r>
+        <w:rPr>
+          <w:rFonts w:ascii="Times New Roman" w:hAnsi="Times New Roman" w:cs="Times New Roman"/>
+          <w:b/>
+          <w:bCs/>
+        </w:rPr>
+        <w:t>idp</w:t>
+      </w:r>
+      <w:proofErr w:type="spellEnd"/>
       <w:r>
         <w:rPr>
           <w:rFonts w:ascii="Times New Roman" w:hAnsi="Times New Roman" w:cs="Times New Roman"/>
@@ -464,8 +486,18 @@
           <w:b/>
           <w:bCs/>
         </w:rPr>
-        <w:t>&gt; cd %PROJECT_HOME%/shibboleth-idp</w:t>
-      </w:r>
+        <w:t>&gt; cd %PROJECT_HOME%/shibboleth-</w:t>
+      </w:r>
+      <w:proofErr w:type="spellStart"/>
+      <w:r>
+        <w:rPr>
+          <w:rFonts w:ascii="Times New Roman" w:hAnsi="Times New Roman" w:cs="Times New Roman"/>
+          <w:b/>
+          <w:bCs/>
+        </w:rPr>
+        <w:t>idp</w:t>
+      </w:r>
+      <w:proofErr w:type="spellEnd"/>
     </w:p>
     <w:p>
       <w:pPr>
@@ -513,18 +545,18 @@
           <w:b/>
           <w:bCs/>
         </w:rPr>
-        <w:t>&gt; bin\plugin.bat -I net.shibboleth.idp.</w:t>
-      </w:r>
-      <w:proofErr w:type="gramStart"/>
-      <w:r>
-        <w:rPr>
-          <w:rFonts w:ascii="Times New Roman" w:hAnsi="Times New Roman" w:cs="Times New Roman"/>
-          <w:b/>
-          <w:bCs/>
-        </w:rPr>
-        <w:t>plugin.jetty</w:t>
-      </w:r>
-      <w:proofErr w:type="gramEnd"/>
+        <w:t xml:space="preserve">&gt; bin\plugin.bat -I </w:t>
+      </w:r>
+      <w:proofErr w:type="spellStart"/>
+      <w:r>
+        <w:rPr>
+          <w:rFonts w:ascii="Times New Roman" w:hAnsi="Times New Roman" w:cs="Times New Roman"/>
+          <w:b/>
+          <w:bCs/>
+        </w:rPr>
+        <w:t>net.shibboleth.idp.plugin.jetty</w:t>
+      </w:r>
+      <w:proofErr w:type="spellEnd"/>
     </w:p>
     <w:p>
       <w:pPr>
@@ -550,14 +582,14 @@
         </w:rPr>
         <w:t>“</w:t>
       </w:r>
-      <w:proofErr w:type="gramStart"/>
+      <w:proofErr w:type="spellStart"/>
       <w:r>
         <w:rPr>
           <w:rFonts w:ascii="Times New Roman" w:hAnsi="Times New Roman" w:cs="Times New Roman"/>
         </w:rPr>
         <w:t>jetty.Core</w:t>
       </w:r>
-      <w:proofErr w:type="gramEnd"/>
+      <w:proofErr w:type="spellEnd"/>
       <w:r>
         <w:rPr>
           <w:rFonts w:ascii="Times New Roman" w:hAnsi="Times New Roman" w:cs="Times New Roman"/>
@@ -590,20 +622,14 @@
         </w:rPr>
         <w:t>To verify, after running the following command, you should see “</w:t>
       </w:r>
-      <w:r>
-        <w:rPr>
-          <w:rFonts w:ascii="Times New Roman" w:hAnsi="Times New Roman" w:cs="Times New Roman"/>
-        </w:rPr>
-        <w:t>net.shibboleth.idp.</w:t>
-      </w:r>
-      <w:proofErr w:type="gramStart"/>
-      <w:r>
-        <w:rPr>
-          <w:rFonts w:ascii="Times New Roman" w:hAnsi="Times New Roman" w:cs="Times New Roman"/>
-        </w:rPr>
-        <w:t>plugin.jetty</w:t>
-      </w:r>
-      <w:proofErr w:type="gramEnd"/>
+      <w:proofErr w:type="spellStart"/>
+      <w:r>
+        <w:rPr>
+          <w:rFonts w:ascii="Times New Roman" w:hAnsi="Times New Roman" w:cs="Times New Roman"/>
+        </w:rPr>
+        <w:t>net.shibboleth.idp.plugin.jetty</w:t>
+      </w:r>
+      <w:proofErr w:type="spellEnd"/>
       <w:r>
         <w:rPr>
           <w:rFonts w:ascii="Times New Roman" w:hAnsi="Times New Roman" w:cs="Times New Roman"/>
@@ -651,8 +677,16 @@
         <w:rPr>
           <w:rFonts w:ascii="Times New Roman" w:hAnsi="Times New Roman" w:cs="Times New Roman"/>
         </w:rPr>
-        <w:t>shibboleth-idp</w:t>
-      </w:r>
+        <w:t>shibboleth-</w:t>
+      </w:r>
+      <w:proofErr w:type="spellStart"/>
+      <w:r>
+        <w:rPr>
+          <w:rFonts w:ascii="Times New Roman" w:hAnsi="Times New Roman" w:cs="Times New Roman"/>
+        </w:rPr>
+        <w:t>idp</w:t>
+      </w:r>
+      <w:proofErr w:type="spellEnd"/>
       <w:r>
         <w:rPr>
           <w:rFonts w:ascii="Times New Roman" w:hAnsi="Times New Roman" w:cs="Times New Roman"/>
@@ -681,6 +715,8 @@
       <w:r>
         <w:rPr>
           <w:rFonts w:ascii="Times New Roman" w:hAnsi="Times New Roman" w:cs="Times New Roman"/>
+          <w:b/>
+          <w:bCs/>
         </w:rPr>
         <w:t>jetty-base-12</w:t>
       </w:r>
@@ -707,9 +743,21 @@
       <w:r>
         <w:rPr>
           <w:rFonts w:ascii="Times New Roman" w:hAnsi="Times New Roman" w:cs="Times New Roman"/>
-        </w:rPr>
-        <w:t>jetty-dist</w:t>
-      </w:r>
+          <w:b/>
+          <w:bCs/>
+        </w:rPr>
+        <w:t>jetty-</w:t>
+      </w:r>
+      <w:proofErr w:type="spellStart"/>
+      <w:r>
+        <w:rPr>
+          <w:rFonts w:ascii="Times New Roman" w:hAnsi="Times New Roman" w:cs="Times New Roman"/>
+          <w:b/>
+          <w:bCs/>
+        </w:rPr>
+        <w:t>dist</w:t>
+      </w:r>
+      <w:proofErr w:type="spellEnd"/>
       <w:r>
         <w:rPr>
           <w:rFonts w:ascii="Times New Roman" w:hAnsi="Times New Roman" w:cs="Times New Roman"/>
@@ -810,8 +858,16 @@
         <w:rPr>
           <w:rFonts w:ascii="Times New Roman" w:hAnsi="Times New Roman" w:cs="Times New Roman"/>
         </w:rPr>
-        <w:t>jetty-dist</w:t>
-      </w:r>
+        <w:t>jetty-</w:t>
+      </w:r>
+      <w:proofErr w:type="spellStart"/>
+      <w:r>
+        <w:rPr>
+          <w:rFonts w:ascii="Times New Roman" w:hAnsi="Times New Roman" w:cs="Times New Roman"/>
+        </w:rPr>
+        <w:t>dist</w:t>
+      </w:r>
+      <w:proofErr w:type="spellEnd"/>
       <w:r>
         <w:rPr>
           <w:rFonts w:ascii="Times New Roman" w:hAnsi="Times New Roman" w:cs="Times New Roman"/>
@@ -1242,64 +1298,146 @@
           <w:bCs/>
         </w:rPr>
       </w:pPr>
-      <w:r>
-        <w:rPr>
-          <w:rFonts w:ascii="Times New Roman" w:hAnsi="Times New Roman" w:cs="Times New Roman"/>
-          <w:b/>
-          <w:bCs/>
-        </w:rPr>
-        <w:t>keytool -genkeypair ^</w:t>
-      </w:r>
-    </w:p>
-    <w:p>
-      <w:pPr>
-        <w:rPr>
-          <w:rFonts w:ascii="Times New Roman" w:hAnsi="Times New Roman" w:cs="Times New Roman"/>
-          <w:b/>
-          <w:bCs/>
-        </w:rPr>
-      </w:pPr>
-      <w:r>
-        <w:rPr>
-          <w:rFonts w:ascii="Times New Roman" w:hAnsi="Times New Roman" w:cs="Times New Roman"/>
-          <w:b/>
-          <w:bCs/>
-        </w:rPr>
-        <w:t xml:space="preserve">  -alias springboot ^</w:t>
-      </w:r>
-    </w:p>
-    <w:p>
-      <w:pPr>
-        <w:rPr>
-          <w:rFonts w:ascii="Times New Roman" w:hAnsi="Times New Roman" w:cs="Times New Roman"/>
-          <w:b/>
-          <w:bCs/>
-        </w:rPr>
-      </w:pPr>
-      <w:r>
-        <w:rPr>
-          <w:rFonts w:ascii="Times New Roman" w:hAnsi="Times New Roman" w:cs="Times New Roman"/>
-          <w:b/>
-          <w:bCs/>
-        </w:rPr>
-        <w:t xml:space="preserve">  -keyalg RSA ^</w:t>
-      </w:r>
-    </w:p>
-    <w:p>
-      <w:pPr>
-        <w:rPr>
-          <w:rFonts w:ascii="Times New Roman" w:hAnsi="Times New Roman" w:cs="Times New Roman"/>
-          <w:b/>
-          <w:bCs/>
-        </w:rPr>
-      </w:pPr>
-      <w:r>
-        <w:rPr>
-          <w:rFonts w:ascii="Times New Roman" w:hAnsi="Times New Roman" w:cs="Times New Roman"/>
-          <w:b/>
-          <w:bCs/>
-        </w:rPr>
-        <w:t xml:space="preserve">  -keysize 2048 ^</w:t>
+      <w:proofErr w:type="spellStart"/>
+      <w:r>
+        <w:rPr>
+          <w:rFonts w:ascii="Times New Roman" w:hAnsi="Times New Roman" w:cs="Times New Roman"/>
+          <w:b/>
+          <w:bCs/>
+        </w:rPr>
+        <w:t>keytool</w:t>
+      </w:r>
+      <w:proofErr w:type="spellEnd"/>
+      <w:r>
+        <w:rPr>
+          <w:rFonts w:ascii="Times New Roman" w:hAnsi="Times New Roman" w:cs="Times New Roman"/>
+          <w:b/>
+          <w:bCs/>
+        </w:rPr>
+        <w:t xml:space="preserve"> -</w:t>
+      </w:r>
+      <w:proofErr w:type="spellStart"/>
+      <w:r>
+        <w:rPr>
+          <w:rFonts w:ascii="Times New Roman" w:hAnsi="Times New Roman" w:cs="Times New Roman"/>
+          <w:b/>
+          <w:bCs/>
+        </w:rPr>
+        <w:t>genkeypair</w:t>
+      </w:r>
+      <w:proofErr w:type="spellEnd"/>
+      <w:r>
+        <w:rPr>
+          <w:rFonts w:ascii="Times New Roman" w:hAnsi="Times New Roman" w:cs="Times New Roman"/>
+          <w:b/>
+          <w:bCs/>
+        </w:rPr>
+        <w:t xml:space="preserve"> ^</w:t>
+      </w:r>
+    </w:p>
+    <w:p>
+      <w:pPr>
+        <w:rPr>
+          <w:rFonts w:ascii="Times New Roman" w:hAnsi="Times New Roman" w:cs="Times New Roman"/>
+          <w:b/>
+          <w:bCs/>
+        </w:rPr>
+      </w:pPr>
+      <w:r>
+        <w:rPr>
+          <w:rFonts w:ascii="Times New Roman" w:hAnsi="Times New Roman" w:cs="Times New Roman"/>
+          <w:b/>
+          <w:bCs/>
+        </w:rPr>
+        <w:t xml:space="preserve">  -alias </w:t>
+      </w:r>
+      <w:proofErr w:type="spellStart"/>
+      <w:r>
+        <w:rPr>
+          <w:rFonts w:ascii="Times New Roman" w:hAnsi="Times New Roman" w:cs="Times New Roman"/>
+          <w:b/>
+          <w:bCs/>
+        </w:rPr>
+        <w:t>springboot</w:t>
+      </w:r>
+      <w:proofErr w:type="spellEnd"/>
+      <w:r>
+        <w:rPr>
+          <w:rFonts w:ascii="Times New Roman" w:hAnsi="Times New Roman" w:cs="Times New Roman"/>
+          <w:b/>
+          <w:bCs/>
+        </w:rPr>
+        <w:t xml:space="preserve"> ^</w:t>
+      </w:r>
+    </w:p>
+    <w:p>
+      <w:pPr>
+        <w:rPr>
+          <w:rFonts w:ascii="Times New Roman" w:hAnsi="Times New Roman" w:cs="Times New Roman"/>
+          <w:b/>
+          <w:bCs/>
+        </w:rPr>
+      </w:pPr>
+      <w:r>
+        <w:rPr>
+          <w:rFonts w:ascii="Times New Roman" w:hAnsi="Times New Roman" w:cs="Times New Roman"/>
+          <w:b/>
+          <w:bCs/>
+        </w:rPr>
+        <w:t xml:space="preserve">  -</w:t>
+      </w:r>
+      <w:proofErr w:type="spellStart"/>
+      <w:r>
+        <w:rPr>
+          <w:rFonts w:ascii="Times New Roman" w:hAnsi="Times New Roman" w:cs="Times New Roman"/>
+          <w:b/>
+          <w:bCs/>
+        </w:rPr>
+        <w:t>keyalg</w:t>
+      </w:r>
+      <w:proofErr w:type="spellEnd"/>
+      <w:r>
+        <w:rPr>
+          <w:rFonts w:ascii="Times New Roman" w:hAnsi="Times New Roman" w:cs="Times New Roman"/>
+          <w:b/>
+          <w:bCs/>
+        </w:rPr>
+        <w:t xml:space="preserve"> RSA ^</w:t>
+      </w:r>
+    </w:p>
+    <w:p>
+      <w:pPr>
+        <w:rPr>
+          <w:rFonts w:ascii="Times New Roman" w:hAnsi="Times New Roman" w:cs="Times New Roman"/>
+          <w:b/>
+          <w:bCs/>
+        </w:rPr>
+      </w:pPr>
+      <w:r>
+        <w:rPr>
+          <w:rFonts w:ascii="Times New Roman" w:hAnsi="Times New Roman" w:cs="Times New Roman"/>
+          <w:b/>
+          <w:bCs/>
+        </w:rPr>
+        <w:t xml:space="preserve">  -</w:t>
+      </w:r>
+      <w:proofErr w:type="spellStart"/>
+      <w:r>
+        <w:rPr>
+          <w:rFonts w:ascii="Times New Roman" w:hAnsi="Times New Roman" w:cs="Times New Roman"/>
+          <w:b/>
+          <w:bCs/>
+        </w:rPr>
+        <w:t>keysize</w:t>
+      </w:r>
+      <w:proofErr w:type="spellEnd"/>
+      <w:r>
+        <w:rPr>
+          <w:rFonts w:ascii="Times New Roman" w:hAnsi="Times New Roman" w:cs="Times New Roman"/>
+          <w:b/>
+          <w:bCs/>
+        </w:rPr>
+        <w:t xml:space="preserve"> 2048 ^</w:t>
       </w:r>
     </w:p>
     <w:p>
@@ -1333,7 +1471,25 @@
           <w:b/>
           <w:bCs/>
         </w:rPr>
-        <w:t xml:space="preserve">  -storetype PKCS12 ^</w:t>
+        <w:t xml:space="preserve">  -</w:t>
+      </w:r>
+      <w:proofErr w:type="spellStart"/>
+      <w:r>
+        <w:rPr>
+          <w:rFonts w:ascii="Times New Roman" w:hAnsi="Times New Roman" w:cs="Times New Roman"/>
+          <w:b/>
+          <w:bCs/>
+        </w:rPr>
+        <w:t>storetype</w:t>
+      </w:r>
+      <w:proofErr w:type="spellEnd"/>
+      <w:r>
+        <w:rPr>
+          <w:rFonts w:ascii="Times New Roman" w:hAnsi="Times New Roman" w:cs="Times New Roman"/>
+          <w:b/>
+          <w:bCs/>
+        </w:rPr>
+        <w:t xml:space="preserve"> PKCS12 ^</w:t>
       </w:r>
     </w:p>
     <w:p>
@@ -1358,25 +1514,7 @@
           <w:b/>
           <w:bCs/>
         </w:rPr>
-        <w:t>springboot-</w:t>
-      </w:r>
-      <w:proofErr w:type="gramStart"/>
-      <w:r>
-        <w:rPr>
-          <w:rFonts w:ascii="Times New Roman" w:hAnsi="Times New Roman" w:cs="Times New Roman"/>
-          <w:b/>
-          <w:bCs/>
-        </w:rPr>
-        <w:t>server.p</w:t>
-      </w:r>
-      <w:proofErr w:type="gramEnd"/>
-      <w:r>
-        <w:rPr>
-          <w:rFonts w:ascii="Times New Roman" w:hAnsi="Times New Roman" w:cs="Times New Roman"/>
-          <w:b/>
-          <w:bCs/>
-        </w:rPr>
-        <w:t xml:space="preserve">12 </w:t>
+        <w:t xml:space="preserve">springboot-server.p12 </w:t>
       </w:r>
       <w:r>
         <w:rPr>
@@ -1401,76 +1539,166 @@
           <w:b/>
           <w:bCs/>
         </w:rPr>
-        <w:t xml:space="preserve">  -storepass changeit ^</w:t>
-      </w:r>
-    </w:p>
-    <w:p>
-      <w:pPr>
-        <w:rPr>
-          <w:rFonts w:ascii="Times New Roman" w:hAnsi="Times New Roman" w:cs="Times New Roman"/>
-          <w:b/>
-          <w:bCs/>
-        </w:rPr>
-      </w:pPr>
-      <w:r>
-        <w:rPr>
-          <w:rFonts w:ascii="Times New Roman" w:hAnsi="Times New Roman" w:cs="Times New Roman"/>
-          <w:b/>
-          <w:bCs/>
-        </w:rPr>
-        <w:t xml:space="preserve">  -keypass changeit ^</w:t>
-      </w:r>
-    </w:p>
-    <w:p>
-      <w:pPr>
-        <w:rPr>
-          <w:rFonts w:ascii="Times New Roman" w:hAnsi="Times New Roman" w:cs="Times New Roman"/>
-          <w:b/>
-          <w:bCs/>
-        </w:rPr>
-      </w:pPr>
-      <w:r>
-        <w:rPr>
-          <w:rFonts w:ascii="Times New Roman" w:hAnsi="Times New Roman" w:cs="Times New Roman"/>
-          <w:b/>
-          <w:bCs/>
-        </w:rPr>
-        <w:t xml:space="preserve">  -dname "CN=localhost, OU=Development, O=Dragon, L=Local, ST=MD, C=US" ^</w:t>
-      </w:r>
-    </w:p>
-    <w:p>
-      <w:pPr>
-        <w:rPr>
-          <w:rFonts w:ascii="Times New Roman" w:hAnsi="Times New Roman" w:cs="Times New Roman"/>
-          <w:b/>
-          <w:bCs/>
-        </w:rPr>
-      </w:pPr>
-      <w:r>
-        <w:rPr>
-          <w:rFonts w:ascii="Times New Roman" w:hAnsi="Times New Roman" w:cs="Times New Roman"/>
-          <w:b/>
-          <w:bCs/>
-        </w:rPr>
-        <w:t xml:space="preserve">  -ext "SAN=dns:</w:t>
-      </w:r>
-      <w:proofErr w:type="gramStart"/>
-      <w:r>
-        <w:rPr>
-          <w:rFonts w:ascii="Times New Roman" w:hAnsi="Times New Roman" w:cs="Times New Roman"/>
-          <w:b/>
-          <w:bCs/>
-        </w:rPr>
-        <w:t>localhost,ip</w:t>
-      </w:r>
-      <w:proofErr w:type="gramEnd"/>
-      <w:r>
-        <w:rPr>
-          <w:rFonts w:ascii="Times New Roman" w:hAnsi="Times New Roman" w:cs="Times New Roman"/>
-          <w:b/>
-          <w:bCs/>
-        </w:rPr>
-        <w:t>:127.0.0.1"</w:t>
+        <w:t xml:space="preserve">  -</w:t>
+      </w:r>
+      <w:proofErr w:type="spellStart"/>
+      <w:r>
+        <w:rPr>
+          <w:rFonts w:ascii="Times New Roman" w:hAnsi="Times New Roman" w:cs="Times New Roman"/>
+          <w:b/>
+          <w:bCs/>
+        </w:rPr>
+        <w:t>storepass</w:t>
+      </w:r>
+      <w:proofErr w:type="spellEnd"/>
+      <w:r>
+        <w:rPr>
+          <w:rFonts w:ascii="Times New Roman" w:hAnsi="Times New Roman" w:cs="Times New Roman"/>
+          <w:b/>
+          <w:bCs/>
+        </w:rPr>
+        <w:t xml:space="preserve"> </w:t>
+      </w:r>
+      <w:proofErr w:type="spellStart"/>
+      <w:r>
+        <w:rPr>
+          <w:rFonts w:ascii="Times New Roman" w:hAnsi="Times New Roman" w:cs="Times New Roman"/>
+          <w:b/>
+          <w:bCs/>
+        </w:rPr>
+        <w:t>changeit</w:t>
+      </w:r>
+      <w:proofErr w:type="spellEnd"/>
+      <w:r>
+        <w:rPr>
+          <w:rFonts w:ascii="Times New Roman" w:hAnsi="Times New Roman" w:cs="Times New Roman"/>
+          <w:b/>
+          <w:bCs/>
+        </w:rPr>
+        <w:t xml:space="preserve"> ^</w:t>
+      </w:r>
+    </w:p>
+    <w:p>
+      <w:pPr>
+        <w:rPr>
+          <w:rFonts w:ascii="Times New Roman" w:hAnsi="Times New Roman" w:cs="Times New Roman"/>
+          <w:b/>
+          <w:bCs/>
+        </w:rPr>
+      </w:pPr>
+      <w:r>
+        <w:rPr>
+          <w:rFonts w:ascii="Times New Roman" w:hAnsi="Times New Roman" w:cs="Times New Roman"/>
+          <w:b/>
+          <w:bCs/>
+        </w:rPr>
+        <w:t xml:space="preserve">  -</w:t>
+      </w:r>
+      <w:proofErr w:type="spellStart"/>
+      <w:r>
+        <w:rPr>
+          <w:rFonts w:ascii="Times New Roman" w:hAnsi="Times New Roman" w:cs="Times New Roman"/>
+          <w:b/>
+          <w:bCs/>
+        </w:rPr>
+        <w:t>keypass</w:t>
+      </w:r>
+      <w:proofErr w:type="spellEnd"/>
+      <w:r>
+        <w:rPr>
+          <w:rFonts w:ascii="Times New Roman" w:hAnsi="Times New Roman" w:cs="Times New Roman"/>
+          <w:b/>
+          <w:bCs/>
+        </w:rPr>
+        <w:t xml:space="preserve"> </w:t>
+      </w:r>
+      <w:proofErr w:type="spellStart"/>
+      <w:r>
+        <w:rPr>
+          <w:rFonts w:ascii="Times New Roman" w:hAnsi="Times New Roman" w:cs="Times New Roman"/>
+          <w:b/>
+          <w:bCs/>
+        </w:rPr>
+        <w:t>changeit</w:t>
+      </w:r>
+      <w:proofErr w:type="spellEnd"/>
+      <w:r>
+        <w:rPr>
+          <w:rFonts w:ascii="Times New Roman" w:hAnsi="Times New Roman" w:cs="Times New Roman"/>
+          <w:b/>
+          <w:bCs/>
+        </w:rPr>
+        <w:t xml:space="preserve"> ^</w:t>
+      </w:r>
+    </w:p>
+    <w:p>
+      <w:pPr>
+        <w:rPr>
+          <w:rFonts w:ascii="Times New Roman" w:hAnsi="Times New Roman" w:cs="Times New Roman"/>
+          <w:b/>
+          <w:bCs/>
+        </w:rPr>
+      </w:pPr>
+      <w:r>
+        <w:rPr>
+          <w:rFonts w:ascii="Times New Roman" w:hAnsi="Times New Roman" w:cs="Times New Roman"/>
+          <w:b/>
+          <w:bCs/>
+        </w:rPr>
+        <w:t xml:space="preserve">  -</w:t>
+      </w:r>
+      <w:proofErr w:type="spellStart"/>
+      <w:r>
+        <w:rPr>
+          <w:rFonts w:ascii="Times New Roman" w:hAnsi="Times New Roman" w:cs="Times New Roman"/>
+          <w:b/>
+          <w:bCs/>
+        </w:rPr>
+        <w:t>dname</w:t>
+      </w:r>
+      <w:proofErr w:type="spellEnd"/>
+      <w:r>
+        <w:rPr>
+          <w:rFonts w:ascii="Times New Roman" w:hAnsi="Times New Roman" w:cs="Times New Roman"/>
+          <w:b/>
+          <w:bCs/>
+        </w:rPr>
+        <w:t xml:space="preserve"> "CN=localhost, OU=Development, O=Dragon, L=Local, ST=MD, C=US" ^</w:t>
+      </w:r>
+    </w:p>
+    <w:p>
+      <w:pPr>
+        <w:rPr>
+          <w:rFonts w:ascii="Times New Roman" w:hAnsi="Times New Roman" w:cs="Times New Roman"/>
+          <w:b/>
+          <w:bCs/>
+        </w:rPr>
+      </w:pPr>
+      <w:r>
+        <w:rPr>
+          <w:rFonts w:ascii="Times New Roman" w:hAnsi="Times New Roman" w:cs="Times New Roman"/>
+          <w:b/>
+          <w:bCs/>
+        </w:rPr>
+        <w:t xml:space="preserve">  -</w:t>
+      </w:r>
+      <w:proofErr w:type="spellStart"/>
+      <w:r>
+        <w:rPr>
+          <w:rFonts w:ascii="Times New Roman" w:hAnsi="Times New Roman" w:cs="Times New Roman"/>
+          <w:b/>
+          <w:bCs/>
+        </w:rPr>
+        <w:t>ext</w:t>
+      </w:r>
+      <w:proofErr w:type="spellEnd"/>
+      <w:r>
+        <w:rPr>
+          <w:rFonts w:ascii="Times New Roman" w:hAnsi="Times New Roman" w:cs="Times New Roman"/>
+          <w:b/>
+          <w:bCs/>
+        </w:rPr>
+        <w:t xml:space="preserve"> "SAN=dns:localhost,ip:127.0.0.1"</w:t>
       </w:r>
     </w:p>
     <w:p>
@@ -1498,25 +1726,7 @@
           <w:b/>
           <w:bCs/>
         </w:rPr>
-        <w:t>springboot-</w:t>
-      </w:r>
-      <w:proofErr w:type="gramStart"/>
-      <w:r>
-        <w:rPr>
-          <w:rFonts w:ascii="Times New Roman" w:hAnsi="Times New Roman" w:cs="Times New Roman"/>
-          <w:b/>
-          <w:bCs/>
-        </w:rPr>
-        <w:t>server.p</w:t>
-      </w:r>
-      <w:proofErr w:type="gramEnd"/>
-      <w:r>
-        <w:rPr>
-          <w:rFonts w:ascii="Times New Roman" w:hAnsi="Times New Roman" w:cs="Times New Roman"/>
-          <w:b/>
-          <w:bCs/>
-        </w:rPr>
-        <w:t>12</w:t>
+        <w:t>springboot-server.p12</w:t>
       </w:r>
       <w:r>
         <w:rPr>
@@ -1569,25 +1779,7 @@
           <w:b/>
           <w:bCs/>
         </w:rPr>
-        <w:t>springboot-</w:t>
-      </w:r>
-      <w:proofErr w:type="gramStart"/>
-      <w:r>
-        <w:rPr>
-          <w:rFonts w:ascii="Times New Roman" w:hAnsi="Times New Roman" w:cs="Times New Roman"/>
-          <w:b/>
-          <w:bCs/>
-        </w:rPr>
-        <w:t>server.p</w:t>
-      </w:r>
-      <w:proofErr w:type="gramEnd"/>
-      <w:r>
-        <w:rPr>
-          <w:rFonts w:ascii="Times New Roman" w:hAnsi="Times New Roman" w:cs="Times New Roman"/>
-          <w:b/>
-          <w:bCs/>
-        </w:rPr>
-        <w:t>12</w:t>
+        <w:t>springboot-server.p12</w:t>
       </w:r>
       <w:r>
         <w:rPr>
@@ -1607,13 +1799,23 @@
         </w:rPr>
         <w:t xml:space="preserve"> </w:t>
       </w:r>
-      <w:r>
-        <w:rPr>
-          <w:rFonts w:ascii="Times New Roman" w:hAnsi="Times New Roman" w:cs="Times New Roman"/>
-          <w:b/>
-          <w:bCs/>
-        </w:rPr>
-        <w:t>src/main/resources</w:t>
+      <w:proofErr w:type="spellStart"/>
+      <w:r>
+        <w:rPr>
+          <w:rFonts w:ascii="Times New Roman" w:hAnsi="Times New Roman" w:cs="Times New Roman"/>
+          <w:b/>
+          <w:bCs/>
+        </w:rPr>
+        <w:t>src</w:t>
+      </w:r>
+      <w:proofErr w:type="spellEnd"/>
+      <w:r>
+        <w:rPr>
+          <w:rFonts w:ascii="Times New Roman" w:hAnsi="Times New Roman" w:cs="Times New Roman"/>
+          <w:b/>
+          <w:bCs/>
+        </w:rPr>
+        <w:t>/main/resources</w:t>
       </w:r>
       <w:r>
         <w:rPr>
@@ -1633,8 +1835,23 @@
         <w:rPr>
           <w:rFonts w:ascii="Times New Roman" w:hAnsi="Times New Roman" w:cs="Times New Roman"/>
         </w:rPr>
-        <w:t xml:space="preserve"> specify ssl properties in </w:t>
-      </w:r>
+        <w:t xml:space="preserve"> specify </w:t>
+      </w:r>
+      <w:proofErr w:type="spellStart"/>
+      <w:r>
+        <w:rPr>
+          <w:rFonts w:ascii="Times New Roman" w:hAnsi="Times New Roman" w:cs="Times New Roman"/>
+        </w:rPr>
+        <w:t>ssl</w:t>
+      </w:r>
+      <w:proofErr w:type="spellEnd"/>
+      <w:r>
+        <w:rPr>
+          <w:rFonts w:ascii="Times New Roman" w:hAnsi="Times New Roman" w:cs="Times New Roman"/>
+        </w:rPr>
+        <w:t xml:space="preserve"> properties in </w:t>
+      </w:r>
+      <w:proofErr w:type="spellStart"/>
       <w:r>
         <w:rPr>
           <w:rFonts w:ascii="Times New Roman" w:hAnsi="Times New Roman" w:cs="Times New Roman"/>
@@ -1643,6 +1860,7 @@
         </w:rPr>
         <w:t>application.yml</w:t>
       </w:r>
+      <w:proofErr w:type="spellEnd"/>
       <w:r>
         <w:rPr>
           <w:rFonts w:ascii="Times New Roman" w:hAnsi="Times New Roman" w:cs="Times New Roman"/>
@@ -1742,30 +1960,94 @@
           <w:bCs/>
         </w:rPr>
       </w:pPr>
-      <w:r>
-        <w:rPr>
-          <w:rFonts w:ascii="Times New Roman" w:hAnsi="Times New Roman" w:cs="Times New Roman"/>
-          <w:b/>
-          <w:bCs/>
-        </w:rPr>
-        <w:t>openssl req -x509 -newkey rsa:2048 ^</w:t>
-      </w:r>
-    </w:p>
-    <w:p>
-      <w:pPr>
-        <w:rPr>
-          <w:rFonts w:ascii="Times New Roman" w:hAnsi="Times New Roman" w:cs="Times New Roman"/>
-          <w:b/>
-          <w:bCs/>
-        </w:rPr>
-      </w:pPr>
-      <w:r>
-        <w:rPr>
-          <w:rFonts w:ascii="Times New Roman" w:hAnsi="Times New Roman" w:cs="Times New Roman"/>
-          <w:b/>
-          <w:bCs/>
-        </w:rPr>
-        <w:t xml:space="preserve">  -keyout spring-saml.key ^</w:t>
+      <w:proofErr w:type="spellStart"/>
+      <w:r>
+        <w:rPr>
+          <w:rFonts w:ascii="Times New Roman" w:hAnsi="Times New Roman" w:cs="Times New Roman"/>
+          <w:b/>
+          <w:bCs/>
+        </w:rPr>
+        <w:t>openssl</w:t>
+      </w:r>
+      <w:proofErr w:type="spellEnd"/>
+      <w:r>
+        <w:rPr>
+          <w:rFonts w:ascii="Times New Roman" w:hAnsi="Times New Roman" w:cs="Times New Roman"/>
+          <w:b/>
+          <w:bCs/>
+        </w:rPr>
+        <w:t xml:space="preserve"> req -x509 -</w:t>
+      </w:r>
+      <w:proofErr w:type="spellStart"/>
+      <w:r>
+        <w:rPr>
+          <w:rFonts w:ascii="Times New Roman" w:hAnsi="Times New Roman" w:cs="Times New Roman"/>
+          <w:b/>
+          <w:bCs/>
+        </w:rPr>
+        <w:t>newkey</w:t>
+      </w:r>
+      <w:proofErr w:type="spellEnd"/>
+      <w:r>
+        <w:rPr>
+          <w:rFonts w:ascii="Times New Roman" w:hAnsi="Times New Roman" w:cs="Times New Roman"/>
+          <w:b/>
+          <w:bCs/>
+        </w:rPr>
+        <w:t xml:space="preserve"> rsa:2048 ^</w:t>
+      </w:r>
+    </w:p>
+    <w:p>
+      <w:pPr>
+        <w:rPr>
+          <w:rFonts w:ascii="Times New Roman" w:hAnsi="Times New Roman" w:cs="Times New Roman"/>
+          <w:b/>
+          <w:bCs/>
+        </w:rPr>
+      </w:pPr>
+      <w:r>
+        <w:rPr>
+          <w:rFonts w:ascii="Times New Roman" w:hAnsi="Times New Roman" w:cs="Times New Roman"/>
+          <w:b/>
+          <w:bCs/>
+        </w:rPr>
+        <w:t xml:space="preserve">  -</w:t>
+      </w:r>
+      <w:proofErr w:type="spellStart"/>
+      <w:r>
+        <w:rPr>
+          <w:rFonts w:ascii="Times New Roman" w:hAnsi="Times New Roman" w:cs="Times New Roman"/>
+          <w:b/>
+          <w:bCs/>
+        </w:rPr>
+        <w:t>keyout</w:t>
+      </w:r>
+      <w:proofErr w:type="spellEnd"/>
+      <w:r>
+        <w:rPr>
+          <w:rFonts w:ascii="Times New Roman" w:hAnsi="Times New Roman" w:cs="Times New Roman"/>
+          <w:b/>
+          <w:bCs/>
+        </w:rPr>
+        <w:t xml:space="preserve"> spring-</w:t>
+      </w:r>
+      <w:proofErr w:type="spellStart"/>
+      <w:r>
+        <w:rPr>
+          <w:rFonts w:ascii="Times New Roman" w:hAnsi="Times New Roman" w:cs="Times New Roman"/>
+          <w:b/>
+          <w:bCs/>
+        </w:rPr>
+        <w:t>saml.key</w:t>
+      </w:r>
+      <w:proofErr w:type="spellEnd"/>
+      <w:r>
+        <w:rPr>
+          <w:rFonts w:ascii="Times New Roman" w:hAnsi="Times New Roman" w:cs="Times New Roman"/>
+          <w:b/>
+          <w:bCs/>
+        </w:rPr>
+        <w:t xml:space="preserve"> ^</w:t>
       </w:r>
     </w:p>
     <w:p>
@@ -1850,7 +2132,25 @@
           <w:b/>
           <w:bCs/>
         </w:rPr>
-        <w:t xml:space="preserve">  -subj "/CN=SpringBoot_Shibboleth_SAML_App/O=Dragon/C=US"</w:t>
+        <w:t xml:space="preserve">  -subj "/CN=</w:t>
+      </w:r>
+      <w:proofErr w:type="spellStart"/>
+      <w:r>
+        <w:rPr>
+          <w:rFonts w:ascii="Times New Roman" w:hAnsi="Times New Roman" w:cs="Times New Roman"/>
+          <w:b/>
+          <w:bCs/>
+        </w:rPr>
+        <w:t>SpringBoot_Shibboleth_SAML_App</w:t>
+      </w:r>
+      <w:proofErr w:type="spellEnd"/>
+      <w:r>
+        <w:rPr>
+          <w:rFonts w:ascii="Times New Roman" w:hAnsi="Times New Roman" w:cs="Times New Roman"/>
+          <w:b/>
+          <w:bCs/>
+        </w:rPr>
+        <w:t>/O=Dragon/C=US"</w:t>
       </w:r>
     </w:p>
     <w:p>
@@ -1885,8 +2185,18 @@
           <w:b/>
           <w:bCs/>
         </w:rPr>
-        <w:t>spring-saml.key</w:t>
-      </w:r>
+        <w:t>spring-</w:t>
+      </w:r>
+      <w:proofErr w:type="spellStart"/>
+      <w:r>
+        <w:rPr>
+          <w:rFonts w:ascii="Times New Roman" w:hAnsi="Times New Roman" w:cs="Times New Roman"/>
+          <w:b/>
+          <w:bCs/>
+        </w:rPr>
+        <w:t>saml.key</w:t>
+      </w:r>
+      <w:proofErr w:type="spellEnd"/>
       <w:r>
         <w:rPr>
           <w:rFonts w:ascii="Times New Roman" w:hAnsi="Times New Roman" w:cs="Times New Roman"/>
@@ -1950,30 +2260,78 @@
           <w:b/>
           <w:bCs/>
         </w:rPr>
-        <w:t>spring-saml.key</w:t>
-      </w:r>
+        <w:t>spring-</w:t>
+      </w:r>
+      <w:proofErr w:type="spellStart"/>
+      <w:r>
+        <w:rPr>
+          <w:rFonts w:ascii="Times New Roman" w:hAnsi="Times New Roman" w:cs="Times New Roman"/>
+          <w:b/>
+          <w:bCs/>
+        </w:rPr>
+        <w:t>saml.key</w:t>
+      </w:r>
+      <w:proofErr w:type="spellEnd"/>
       <w:r>
         <w:rPr>
           <w:rFonts w:ascii="Times New Roman" w:hAnsi="Times New Roman" w:cs="Times New Roman"/>
         </w:rPr>
         <w:t xml:space="preserve"> to </w:t>
       </w:r>
-      <w:r>
-        <w:rPr>
-          <w:rFonts w:ascii="Times New Roman" w:hAnsi="Times New Roman" w:cs="Times New Roman"/>
-          <w:b/>
-          <w:bCs/>
-        </w:rPr>
-        <w:t>src/main/resources</w:t>
-      </w:r>
-      <w:r>
-        <w:rPr>
-          <w:rFonts w:ascii="Times New Roman" w:hAnsi="Times New Roman" w:cs="Times New Roman"/>
-          <w:b/>
-          <w:bCs/>
-        </w:rPr>
-        <w:t>/saml/signingcerts</w:t>
-      </w:r>
+      <w:proofErr w:type="spellStart"/>
+      <w:r>
+        <w:rPr>
+          <w:rFonts w:ascii="Times New Roman" w:hAnsi="Times New Roman" w:cs="Times New Roman"/>
+          <w:b/>
+          <w:bCs/>
+        </w:rPr>
+        <w:t>src</w:t>
+      </w:r>
+      <w:proofErr w:type="spellEnd"/>
+      <w:r>
+        <w:rPr>
+          <w:rFonts w:ascii="Times New Roman" w:hAnsi="Times New Roman" w:cs="Times New Roman"/>
+          <w:b/>
+          <w:bCs/>
+        </w:rPr>
+        <w:t>/main/resources</w:t>
+      </w:r>
+      <w:r>
+        <w:rPr>
+          <w:rFonts w:ascii="Times New Roman" w:hAnsi="Times New Roman" w:cs="Times New Roman"/>
+          <w:b/>
+          <w:bCs/>
+        </w:rPr>
+        <w:t>/</w:t>
+      </w:r>
+      <w:proofErr w:type="spellStart"/>
+      <w:r>
+        <w:rPr>
+          <w:rFonts w:ascii="Times New Roman" w:hAnsi="Times New Roman" w:cs="Times New Roman"/>
+          <w:b/>
+          <w:bCs/>
+        </w:rPr>
+        <w:t>saml</w:t>
+      </w:r>
+      <w:proofErr w:type="spellEnd"/>
+      <w:r>
+        <w:rPr>
+          <w:rFonts w:ascii="Times New Roman" w:hAnsi="Times New Roman" w:cs="Times New Roman"/>
+          <w:b/>
+          <w:bCs/>
+        </w:rPr>
+        <w:t>/</w:t>
+      </w:r>
+      <w:proofErr w:type="spellStart"/>
+      <w:r>
+        <w:rPr>
+          <w:rFonts w:ascii="Times New Roman" w:hAnsi="Times New Roman" w:cs="Times New Roman"/>
+          <w:b/>
+          <w:bCs/>
+        </w:rPr>
+        <w:t>signingcerts</w:t>
+      </w:r>
+      <w:proofErr w:type="spellEnd"/>
       <w:r>
         <w:rPr>
           <w:rFonts w:ascii="Times New Roman" w:hAnsi="Times New Roman" w:cs="Times New Roman"/>
@@ -1988,6 +2346,7 @@
         </w:rPr>
         <w:t xml:space="preserve">and specify values in </w:t>
       </w:r>
+      <w:proofErr w:type="spellStart"/>
       <w:r>
         <w:rPr>
           <w:rFonts w:ascii="Times New Roman" w:hAnsi="Times New Roman" w:cs="Times New Roman"/>
@@ -1996,6 +2355,7 @@
         </w:rPr>
         <w:t>application.yml</w:t>
       </w:r>
+      <w:proofErr w:type="spellEnd"/>
       <w:r>
         <w:rPr>
           <w:rFonts w:ascii="Times New Roman" w:hAnsi="Times New Roman" w:cs="Times New Roman"/>
@@ -2137,13 +2497,41 @@
         </w:rPr>
         <w:t xml:space="preserve"> under </w:t>
       </w:r>
-      <w:r>
-        <w:rPr>
-          <w:rFonts w:ascii="Times New Roman" w:hAnsi="Times New Roman" w:cs="Times New Roman"/>
-          <w:b/>
-          <w:bCs/>
-        </w:rPr>
-        <w:t>src/main/resources/saml/</w:t>
+      <w:proofErr w:type="spellStart"/>
+      <w:r>
+        <w:rPr>
+          <w:rFonts w:ascii="Times New Roman" w:hAnsi="Times New Roman" w:cs="Times New Roman"/>
+          <w:b/>
+          <w:bCs/>
+        </w:rPr>
+        <w:t>src</w:t>
+      </w:r>
+      <w:proofErr w:type="spellEnd"/>
+      <w:r>
+        <w:rPr>
+          <w:rFonts w:ascii="Times New Roman" w:hAnsi="Times New Roman" w:cs="Times New Roman"/>
+          <w:b/>
+          <w:bCs/>
+        </w:rPr>
+        <w:t>/main/resources/</w:t>
+      </w:r>
+      <w:proofErr w:type="spellStart"/>
+      <w:r>
+        <w:rPr>
+          <w:rFonts w:ascii="Times New Roman" w:hAnsi="Times New Roman" w:cs="Times New Roman"/>
+          <w:b/>
+          <w:bCs/>
+        </w:rPr>
+        <w:t>saml</w:t>
+      </w:r>
+      <w:proofErr w:type="spellEnd"/>
+      <w:r>
+        <w:rPr>
+          <w:rFonts w:ascii="Times New Roman" w:hAnsi="Times New Roman" w:cs="Times New Roman"/>
+          <w:b/>
+          <w:bCs/>
+        </w:rPr>
+        <w:t>/</w:t>
       </w:r>
       <w:r>
         <w:rPr>
@@ -2232,11 +2620,19 @@
         </w:rPr>
         <w:t xml:space="preserve">sign the authentication request, add </w:t>
       </w:r>
-      <w:r>
-        <w:rPr>
-          <w:rFonts w:ascii="Times New Roman" w:hAnsi="Times New Roman" w:cs="Times New Roman"/>
-        </w:rPr>
-        <w:t>WantAuthnRequestsSigned="true"</w:t>
+      <w:proofErr w:type="spellStart"/>
+      <w:r>
+        <w:rPr>
+          <w:rFonts w:ascii="Times New Roman" w:hAnsi="Times New Roman" w:cs="Times New Roman"/>
+        </w:rPr>
+        <w:t>WantAuthnRequestsSigned</w:t>
+      </w:r>
+      <w:proofErr w:type="spellEnd"/>
+      <w:r>
+        <w:rPr>
+          <w:rFonts w:ascii="Times New Roman" w:hAnsi="Times New Roman" w:cs="Times New Roman"/>
+        </w:rPr>
+        <w:t>="true"</w:t>
       </w:r>
       <w:r>
         <w:rPr>
@@ -2376,12 +2772,14 @@
         </w:rPr>
         <w:t>.  If the redirect strings contain “</w:t>
       </w:r>
+      <w:proofErr w:type="spellStart"/>
       <w:r>
         <w:rPr>
           <w:rFonts w:ascii="Times New Roman" w:hAnsi="Times New Roman" w:cs="Times New Roman"/>
         </w:rPr>
         <w:t>SigAlg</w:t>
       </w:r>
+      <w:proofErr w:type="spellEnd"/>
       <w:r>
         <w:rPr>
           <w:rFonts w:ascii="Times New Roman" w:hAnsi="Times New Roman" w:cs="Times New Roman"/>
@@ -2625,6 +3023,7 @@
         </w:rPr>
         <w:t xml:space="preserve">In </w:t>
       </w:r>
+      <w:proofErr w:type="spellStart"/>
       <w:r>
         <w:rPr>
           <w:rFonts w:ascii="Times New Roman" w:hAnsi="Times New Roman" w:cs="Times New Roman"/>
@@ -2633,6 +3032,7 @@
         </w:rPr>
         <w:t>application.yml</w:t>
       </w:r>
+      <w:proofErr w:type="spellEnd"/>
       <w:r>
         <w:rPr>
           <w:rFonts w:ascii="Times New Roman" w:hAnsi="Times New Roman" w:cs="Times New Roman"/>
@@ -2782,7 +3182,19 @@
         <w:rPr>
           <w:rFonts w:ascii="Times New Roman" w:hAnsi="Times New Roman" w:cs="Times New Roman"/>
         </w:rPr>
-        <w:t xml:space="preserve">Create 2 such Spring Boot applications.  Make one is running at </w:t>
+        <w:t xml:space="preserve">Create 2 such Spring Boot applications.  Make one </w:t>
+      </w:r>
+      <w:r>
+        <w:rPr>
+          <w:rFonts w:ascii="Times New Roman" w:hAnsi="Times New Roman" w:cs="Times New Roman"/>
+        </w:rPr>
+        <w:t>to be</w:t>
+      </w:r>
+      <w:r>
+        <w:rPr>
+          <w:rFonts w:ascii="Times New Roman" w:hAnsi="Times New Roman" w:cs="Times New Roman"/>
+        </w:rPr>
+        <w:t xml:space="preserve"> running at </w:t>
       </w:r>
       <w:hyperlink r:id="rId17" w:history="1">
         <w:r>
@@ -2797,7 +3209,19 @@
         <w:rPr>
           <w:rFonts w:ascii="Times New Roman" w:hAnsi="Times New Roman" w:cs="Times New Roman"/>
         </w:rPr>
-        <w:t xml:space="preserve"> and another is running at </w:t>
+        <w:t xml:space="preserve"> and another </w:t>
+      </w:r>
+      <w:r>
+        <w:rPr>
+          <w:rFonts w:ascii="Times New Roman" w:hAnsi="Times New Roman" w:cs="Times New Roman"/>
+        </w:rPr>
+        <w:t>one to be</w:t>
+      </w:r>
+      <w:r>
+        <w:rPr>
+          <w:rFonts w:ascii="Times New Roman" w:hAnsi="Times New Roman" w:cs="Times New Roman"/>
+        </w:rPr>
+        <w:t xml:space="preserve"> running at </w:t>
       </w:r>
       <w:hyperlink r:id="rId18" w:history="1">
         <w:r>
@@ -2880,7 +3304,32 @@
         <w:rPr>
           <w:rFonts w:ascii="Times New Roman" w:hAnsi="Times New Roman" w:cs="Times New Roman"/>
         </w:rPr>
-        <w:t xml:space="preserve"> Obtain 2nd SP metadata at </w:t>
+        <w:t xml:space="preserve"> Obtain </w:t>
+      </w:r>
+      <w:r>
+        <w:rPr>
+          <w:rFonts w:ascii="Times New Roman" w:hAnsi="Times New Roman" w:cs="Times New Roman"/>
+        </w:rPr>
+        <w:t>2</w:t>
+      </w:r>
+      <w:r>
+        <w:rPr>
+          <w:rFonts w:ascii="Times New Roman" w:hAnsi="Times New Roman" w:cs="Times New Roman"/>
+          <w:vertAlign w:val="superscript"/>
+        </w:rPr>
+        <w:t>nd</w:t>
+      </w:r>
+      <w:r>
+        <w:rPr>
+          <w:rFonts w:ascii="Times New Roman" w:hAnsi="Times New Roman" w:cs="Times New Roman"/>
+        </w:rPr>
+        <w:t xml:space="preserve"> </w:t>
+      </w:r>
+      <w:r>
+        <w:rPr>
+          <w:rFonts w:ascii="Times New Roman" w:hAnsi="Times New Roman" w:cs="Times New Roman"/>
+        </w:rPr>
+        <w:t xml:space="preserve">SP metadata at </w:t>
       </w:r>
       <w:hyperlink r:id="rId20" w:history="1">
         <w:r>
@@ -2979,7 +3428,19 @@
         <w:rPr>
           <w:rFonts w:ascii="Times New Roman" w:hAnsi="Times New Roman" w:cs="Times New Roman"/>
         </w:rPr>
-        <w:t>Save the Spring metadata in Shibboleth</w:t>
+        <w:t xml:space="preserve">Save the Spring </w:t>
+      </w:r>
+      <w:r>
+        <w:rPr>
+          <w:rFonts w:ascii="Times New Roman" w:hAnsi="Times New Roman" w:cs="Times New Roman"/>
+        </w:rPr>
+        <w:t xml:space="preserve">SP </w:t>
+      </w:r>
+      <w:r>
+        <w:rPr>
+          <w:rFonts w:ascii="Times New Roman" w:hAnsi="Times New Roman" w:cs="Times New Roman"/>
+        </w:rPr>
+        <w:t>metadata in Shibboleth</w:t>
       </w:r>
       <w:r>
         <w:rPr>
@@ -3000,7 +3461,6 @@
         </w:rPr>
         <w:t xml:space="preserve">Copy SP metadata files </w:t>
       </w:r>
-      <w:proofErr w:type="gramStart"/>
       <w:r>
         <w:rPr>
           <w:rFonts w:ascii="Times New Roman" w:hAnsi="Times New Roman" w:cs="Times New Roman"/>
@@ -3013,9 +3473,76 @@
         <w:rPr>
           <w:rFonts w:ascii="Times New Roman" w:hAnsi="Times New Roman" w:cs="Times New Roman"/>
         </w:rPr>
-        <w:t xml:space="preserve">  and</w:t>
-      </w:r>
-      <w:proofErr w:type="gramEnd"/>
+        <w:t xml:space="preserve">  and </w:t>
+      </w:r>
+      <w:r>
+        <w:rPr>
+          <w:rFonts w:ascii="Times New Roman" w:hAnsi="Times New Roman" w:cs="Times New Roman"/>
+          <w:b/>
+          <w:bCs/>
+        </w:rPr>
+        <w:t>springboot-sp-metadata2.xml</w:t>
+      </w:r>
+      <w:r>
+        <w:rPr>
+          <w:rFonts w:ascii="Times New Roman" w:hAnsi="Times New Roman" w:cs="Times New Roman"/>
+        </w:rPr>
+        <w:t xml:space="preserve"> under </w:t>
+      </w:r>
+      <w:r>
+        <w:rPr>
+          <w:rFonts w:ascii="Times New Roman" w:hAnsi="Times New Roman" w:cs="Times New Roman"/>
+          <w:b/>
+          <w:bCs/>
+        </w:rPr>
+        <w:t>%PROJECT_HOME%/shibboleth-</w:t>
+      </w:r>
+      <w:proofErr w:type="spellStart"/>
+      <w:r>
+        <w:rPr>
+          <w:rFonts w:ascii="Times New Roman" w:hAnsi="Times New Roman" w:cs="Times New Roman"/>
+          <w:b/>
+          <w:bCs/>
+        </w:rPr>
+        <w:t>idp</w:t>
+      </w:r>
+      <w:proofErr w:type="spellEnd"/>
+      <w:r>
+        <w:rPr>
+          <w:rFonts w:ascii="Times New Roman" w:hAnsi="Times New Roman" w:cs="Times New Roman"/>
+          <w:b/>
+          <w:bCs/>
+        </w:rPr>
+        <w:t>/metadata</w:t>
+      </w:r>
+      <w:r>
+        <w:rPr>
+          <w:rFonts w:ascii="Times New Roman" w:hAnsi="Times New Roman" w:cs="Times New Roman"/>
+        </w:rPr>
+        <w:t>.</w:t>
+      </w:r>
+    </w:p>
+    <w:p>
+      <w:pPr>
+        <w:rPr>
+          <w:rFonts w:ascii="Times New Roman" w:hAnsi="Times New Roman" w:cs="Times New Roman"/>
+        </w:rPr>
+      </w:pPr>
+    </w:p>
+    <w:p>
+      <w:pPr>
+        <w:rPr>
+          <w:rFonts w:ascii="Times New Roman" w:hAnsi="Times New Roman" w:cs="Times New Roman"/>
+          <w:b/>
+          <w:bCs/>
+        </w:rPr>
+      </w:pPr>
+      <w:r>
+        <w:rPr>
+          <w:rFonts w:ascii="Times New Roman" w:hAnsi="Times New Roman" w:cs="Times New Roman"/>
+        </w:rPr>
+        <w:t>Tell Shibboleth about Spring Boot</w:t>
+      </w:r>
       <w:r>
         <w:rPr>
           <w:rFonts w:ascii="Times New Roman" w:hAnsi="Times New Roman" w:cs="Times New Roman"/>
@@ -3025,62 +3552,6 @@
       <w:r>
         <w:rPr>
           <w:rFonts w:ascii="Times New Roman" w:hAnsi="Times New Roman" w:cs="Times New Roman"/>
-          <w:b/>
-          <w:bCs/>
-        </w:rPr>
-        <w:t>springboot-sp-metadata2.xml</w:t>
-      </w:r>
-      <w:r>
-        <w:rPr>
-          <w:rFonts w:ascii="Times New Roman" w:hAnsi="Times New Roman" w:cs="Times New Roman"/>
-        </w:rPr>
-        <w:t xml:space="preserve"> under </w:t>
-      </w:r>
-      <w:r>
-        <w:rPr>
-          <w:rFonts w:ascii="Times New Roman" w:hAnsi="Times New Roman" w:cs="Times New Roman"/>
-          <w:b/>
-          <w:bCs/>
-        </w:rPr>
-        <w:t>%PROJECT_HOME%/shibboleth-idp/metadata</w:t>
-      </w:r>
-      <w:r>
-        <w:rPr>
-          <w:rFonts w:ascii="Times New Roman" w:hAnsi="Times New Roman" w:cs="Times New Roman"/>
-        </w:rPr>
-        <w:t>.</w:t>
-      </w:r>
-    </w:p>
-    <w:p>
-      <w:pPr>
-        <w:rPr>
-          <w:rFonts w:ascii="Times New Roman" w:hAnsi="Times New Roman" w:cs="Times New Roman"/>
-        </w:rPr>
-      </w:pPr>
-    </w:p>
-    <w:p>
-      <w:pPr>
-        <w:rPr>
-          <w:rFonts w:ascii="Times New Roman" w:hAnsi="Times New Roman" w:cs="Times New Roman"/>
-          <w:b/>
-          <w:bCs/>
-        </w:rPr>
-      </w:pPr>
-      <w:r>
-        <w:rPr>
-          <w:rFonts w:ascii="Times New Roman" w:hAnsi="Times New Roman" w:cs="Times New Roman"/>
-        </w:rPr>
-        <w:t>Tell Shibboleth about Spring Boot</w:t>
-      </w:r>
-      <w:r>
-        <w:rPr>
-          <w:rFonts w:ascii="Times New Roman" w:hAnsi="Times New Roman" w:cs="Times New Roman"/>
-        </w:rPr>
-        <w:t xml:space="preserve"> </w:t>
-      </w:r>
-      <w:r>
-        <w:rPr>
-          <w:rFonts w:ascii="Times New Roman" w:hAnsi="Times New Roman" w:cs="Times New Roman"/>
         </w:rPr>
         <w:t xml:space="preserve">applications’ metadata </w:t>
       </w:r>
@@ -3096,7 +3567,25 @@
           <w:b/>
           <w:bCs/>
         </w:rPr>
-        <w:t>%PROJECT_HOME%/shibboleth-idp/conf/metadata-providers.xml:</w:t>
+        <w:t>%PROJECT_HOME%/shibboleth-</w:t>
+      </w:r>
+      <w:proofErr w:type="spellStart"/>
+      <w:r>
+        <w:rPr>
+          <w:rFonts w:ascii="Times New Roman" w:hAnsi="Times New Roman" w:cs="Times New Roman"/>
+          <w:b/>
+          <w:bCs/>
+        </w:rPr>
+        <w:t>idp</w:t>
+      </w:r>
+      <w:proofErr w:type="spellEnd"/>
+      <w:r>
+        <w:rPr>
+          <w:rFonts w:ascii="Times New Roman" w:hAnsi="Times New Roman" w:cs="Times New Roman"/>
+          <w:b/>
+          <w:bCs/>
+        </w:rPr>
+        <w:t>/conf/metadata-providers.xml:</w:t>
       </w:r>
     </w:p>
     <w:p>
@@ -3204,8 +3693,18 @@
           <w:b/>
           <w:bCs/>
         </w:rPr>
-        <w:t>cd %PROJECT_HOME%/shibboleth-idp</w:t>
-      </w:r>
+        <w:t>cd %PROJECT_HOME%/shibboleth-</w:t>
+      </w:r>
+      <w:proofErr w:type="spellStart"/>
+      <w:r>
+        <w:rPr>
+          <w:rFonts w:ascii="Times New Roman" w:hAnsi="Times New Roman" w:cs="Times New Roman"/>
+          <w:b/>
+          <w:bCs/>
+        </w:rPr>
+        <w:t>idp</w:t>
+      </w:r>
+      <w:proofErr w:type="spellEnd"/>
     </w:p>
     <w:p>
       <w:pPr>
@@ -3231,24 +3730,16 @@
         </w:rPr>
         <w:t xml:space="preserve">bin\module.bat -t </w:t>
       </w:r>
-      <w:proofErr w:type="gramStart"/>
-      <w:r>
-        <w:rPr>
-          <w:rFonts w:ascii="Times New Roman" w:hAnsi="Times New Roman" w:cs="Times New Roman"/>
-          <w:b/>
-          <w:bCs/>
-        </w:rPr>
-        <w:t>idp.authn</w:t>
-      </w:r>
-      <w:proofErr w:type="gramEnd"/>
-      <w:r>
-        <w:rPr>
-          <w:rFonts w:ascii="Times New Roman" w:hAnsi="Times New Roman" w:cs="Times New Roman"/>
-          <w:b/>
-          <w:bCs/>
-        </w:rPr>
-        <w:t>.Password</w:t>
-      </w:r>
+      <w:proofErr w:type="spellStart"/>
+      <w:r>
+        <w:rPr>
+          <w:rFonts w:ascii="Times New Roman" w:hAnsi="Times New Roman" w:cs="Times New Roman"/>
+          <w:b/>
+          <w:bCs/>
+        </w:rPr>
+        <w:t>idp.authn.Password</w:t>
+      </w:r>
+      <w:proofErr w:type="spellEnd"/>
     </w:p>
     <w:p>
       <w:pPr>
@@ -3279,24 +3770,16 @@
         </w:rPr>
         <w:t xml:space="preserve">&gt; bin\module.bat -e </w:t>
       </w:r>
-      <w:proofErr w:type="gramStart"/>
-      <w:r>
-        <w:rPr>
-          <w:rFonts w:ascii="Times New Roman" w:hAnsi="Times New Roman" w:cs="Times New Roman"/>
-          <w:b/>
-          <w:bCs/>
-        </w:rPr>
-        <w:t>idp.authn</w:t>
-      </w:r>
-      <w:proofErr w:type="gramEnd"/>
-      <w:r>
-        <w:rPr>
-          <w:rFonts w:ascii="Times New Roman" w:hAnsi="Times New Roman" w:cs="Times New Roman"/>
-          <w:b/>
-          <w:bCs/>
-        </w:rPr>
-        <w:t>.Password</w:t>
-      </w:r>
+      <w:proofErr w:type="spellStart"/>
+      <w:r>
+        <w:rPr>
+          <w:rFonts w:ascii="Times New Roman" w:hAnsi="Times New Roman" w:cs="Times New Roman"/>
+          <w:b/>
+          <w:bCs/>
+        </w:rPr>
+        <w:t>idp.authn.Password</w:t>
+      </w:r>
+      <w:proofErr w:type="spellEnd"/>
     </w:p>
     <w:p>
       <w:pPr>
@@ -3334,8 +3817,18 @@
           <w:b/>
           <w:bCs/>
         </w:rPr>
-        <w:t>shibboleth-idp</w:t>
-      </w:r>
+        <w:t>shibboleth-</w:t>
+      </w:r>
+      <w:proofErr w:type="spellStart"/>
+      <w:r>
+        <w:rPr>
+          <w:rFonts w:ascii="Times New Roman" w:hAnsi="Times New Roman" w:cs="Times New Roman"/>
+          <w:b/>
+          <w:bCs/>
+        </w:rPr>
+        <w:t>idp</w:t>
+      </w:r>
+      <w:proofErr w:type="spellEnd"/>
       <w:r>
         <w:rPr>
           <w:rFonts w:ascii="Times New Roman" w:hAnsi="Times New Roman" w:cs="Times New Roman"/>
@@ -3360,6 +3853,7 @@
         </w:rPr>
         <w:t>/</w:t>
       </w:r>
+      <w:proofErr w:type="spellStart"/>
       <w:r>
         <w:rPr>
           <w:rFonts w:ascii="Times New Roman" w:hAnsi="Times New Roman" w:cs="Times New Roman"/>
@@ -3368,6 +3862,7 @@
         </w:rPr>
         <w:t>authn</w:t>
       </w:r>
+      <w:proofErr w:type="spellEnd"/>
       <w:r>
         <w:rPr>
           <w:rFonts w:ascii="Times New Roman" w:hAnsi="Times New Roman" w:cs="Times New Roman"/>
@@ -3376,6 +3871,7 @@
         </w:rPr>
         <w:t>/</w:t>
       </w:r>
+      <w:proofErr w:type="spellStart"/>
       <w:r>
         <w:rPr>
           <w:rFonts w:ascii="Times New Roman" w:hAnsi="Times New Roman" w:cs="Times New Roman"/>
@@ -3384,25 +3880,46 @@
         </w:rPr>
         <w:t>authn.properties</w:t>
       </w:r>
-    </w:p>
-    <w:p>
-      <w:pPr>
-        <w:rPr>
-          <w:rFonts w:ascii="Times New Roman" w:hAnsi="Times New Roman" w:cs="Times New Roman"/>
-        </w:rPr>
-      </w:pPr>
-    </w:p>
-    <w:p>
-      <w:pPr>
-        <w:rPr>
-          <w:rFonts w:ascii="Times New Roman" w:hAnsi="Times New Roman" w:cs="Times New Roman"/>
-        </w:rPr>
-      </w:pPr>
-      <w:r>
-        <w:rPr>
-          <w:rFonts w:ascii="Times New Roman" w:hAnsi="Times New Roman" w:cs="Times New Roman"/>
-        </w:rPr>
-        <w:t>Configure HTPasswd as our temporary user database</w:t>
+      <w:proofErr w:type="spellEnd"/>
+    </w:p>
+    <w:p>
+      <w:pPr>
+        <w:rPr>
+          <w:rFonts w:ascii="Times New Roman" w:hAnsi="Times New Roman" w:cs="Times New Roman"/>
+        </w:rPr>
+      </w:pPr>
+    </w:p>
+    <w:p>
+      <w:pPr>
+        <w:rPr>
+          <w:rFonts w:ascii="Times New Roman" w:hAnsi="Times New Roman" w:cs="Times New Roman"/>
+        </w:rPr>
+      </w:pPr>
+      <w:r>
+        <w:rPr>
+          <w:rFonts w:ascii="Times New Roman" w:hAnsi="Times New Roman" w:cs="Times New Roman"/>
+        </w:rPr>
+        <w:t xml:space="preserve">Configure </w:t>
+      </w:r>
+      <w:proofErr w:type="spellStart"/>
+      <w:r>
+        <w:rPr>
+          <w:rFonts w:ascii="Times New Roman" w:hAnsi="Times New Roman" w:cs="Times New Roman"/>
+        </w:rPr>
+        <w:t>HTPasswd</w:t>
+      </w:r>
+      <w:proofErr w:type="spellEnd"/>
+      <w:r>
+        <w:rPr>
+          <w:rFonts w:ascii="Times New Roman" w:hAnsi="Times New Roman" w:cs="Times New Roman"/>
+        </w:rPr>
+        <w:t xml:space="preserve"> as our temporary user database</w:t>
+      </w:r>
+      <w:r>
+        <w:rPr>
+          <w:rFonts w:ascii="Times New Roman" w:hAnsi="Times New Roman" w:cs="Times New Roman"/>
+        </w:rPr>
+        <w:t xml:space="preserve"> only for demo purpose</w:t>
       </w:r>
       <w:r>
         <w:rPr>
@@ -3445,8 +3962,36 @@
           <w:b/>
           <w:bCs/>
         </w:rPr>
-        <w:t>%PROJECT_HOME%\shibboleth-idp\conf\authn</w:t>
-      </w:r>
+        <w:t>%PROJECT_HOME%\shibboleth-</w:t>
+      </w:r>
+      <w:proofErr w:type="spellStart"/>
+      <w:r>
+        <w:rPr>
+          <w:rFonts w:ascii="Times New Roman" w:hAnsi="Times New Roman" w:cs="Times New Roman"/>
+          <w:b/>
+          <w:bCs/>
+        </w:rPr>
+        <w:t>idp</w:t>
+      </w:r>
+      <w:proofErr w:type="spellEnd"/>
+      <w:r>
+        <w:rPr>
+          <w:rFonts w:ascii="Times New Roman" w:hAnsi="Times New Roman" w:cs="Times New Roman"/>
+          <w:b/>
+          <w:bCs/>
+        </w:rPr>
+        <w:t>\conf\</w:t>
+      </w:r>
+      <w:proofErr w:type="spellStart"/>
+      <w:r>
+        <w:rPr>
+          <w:rFonts w:ascii="Times New Roman" w:hAnsi="Times New Roman" w:cs="Times New Roman"/>
+          <w:b/>
+          <w:bCs/>
+        </w:rPr>
+        <w:t>authn</w:t>
+      </w:r>
+      <w:proofErr w:type="spellEnd"/>
     </w:p>
     <w:p>
       <w:pPr>
@@ -3482,14 +4027,14 @@
         </w:rPr>
         <w:t xml:space="preserve">contains </w:t>
       </w:r>
-      <w:proofErr w:type="gramStart"/>
+      <w:proofErr w:type="spellStart"/>
       <w:r>
         <w:rPr>
           <w:rFonts w:ascii="Times New Roman" w:hAnsi="Times New Roman" w:cs="Times New Roman"/>
         </w:rPr>
         <w:t>username:encrypted</w:t>
       </w:r>
-      <w:proofErr w:type="gramEnd"/>
+      <w:proofErr w:type="spellEnd"/>
       <w:r>
         <w:rPr>
           <w:rFonts w:ascii="Times New Roman" w:hAnsi="Times New Roman" w:cs="Times New Roman"/>
@@ -3506,8 +4051,16 @@
         <w:rPr>
           <w:rFonts w:ascii="Times New Roman" w:hAnsi="Times New Roman" w:cs="Times New Roman"/>
         </w:rPr>
-        <w:t>Apache htpasswd</w:t>
-      </w:r>
+        <w:t xml:space="preserve">Apache </w:t>
+      </w:r>
+      <w:proofErr w:type="spellStart"/>
+      <w:r>
+        <w:rPr>
+          <w:rFonts w:ascii="Times New Roman" w:hAnsi="Times New Roman" w:cs="Times New Roman"/>
+        </w:rPr>
+        <w:t>htpasswd</w:t>
+      </w:r>
+      <w:proofErr w:type="spellEnd"/>
       <w:r>
         <w:rPr>
           <w:rFonts w:ascii="Times New Roman" w:hAnsi="Times New Roman" w:cs="Times New Roman"/>
@@ -3529,7 +4082,25 @@
           <w:b/>
           <w:bCs/>
         </w:rPr>
-        <w:t xml:space="preserve">&gt; htpasswd -c </w:t>
+        <w:t xml:space="preserve">&gt; </w:t>
+      </w:r>
+      <w:proofErr w:type="spellStart"/>
+      <w:r>
+        <w:rPr>
+          <w:rFonts w:ascii="Times New Roman" w:hAnsi="Times New Roman" w:cs="Times New Roman"/>
+          <w:b/>
+          <w:bCs/>
+        </w:rPr>
+        <w:t>htpasswd</w:t>
+      </w:r>
+      <w:proofErr w:type="spellEnd"/>
+      <w:r>
+        <w:rPr>
+          <w:rFonts w:ascii="Times New Roman" w:hAnsi="Times New Roman" w:cs="Times New Roman"/>
+          <w:b/>
+          <w:bCs/>
+        </w:rPr>
+        <w:t xml:space="preserve"> -c </w:t>
       </w:r>
       <w:r>
         <w:rPr>
@@ -3553,46 +4124,108 @@
           <w:b/>
           <w:bCs/>
         </w:rPr>
-        <w:t>shibboleth-idp</w:t>
-      </w:r>
-      <w:r>
-        <w:rPr>
-          <w:rFonts w:ascii="Times New Roman" w:hAnsi="Times New Roman" w:cs="Times New Roman"/>
-          <w:b/>
-          <w:bCs/>
-        </w:rPr>
-        <w:t>\conf\authn\htpasswd.txt testuser</w:t>
-      </w:r>
-    </w:p>
-    <w:p>
-      <w:pPr>
-        <w:rPr>
-          <w:rFonts w:ascii="Times New Roman" w:hAnsi="Times New Roman" w:cs="Times New Roman"/>
-        </w:rPr>
-      </w:pPr>
-      <w:r>
-        <w:rPr>
-          <w:rFonts w:ascii="Times New Roman" w:hAnsi="Times New Roman" w:cs="Times New Roman"/>
-        </w:rPr>
-        <w:t>Or we can use Python passLib:</w:t>
-      </w:r>
-    </w:p>
-    <w:p>
-      <w:pPr>
-        <w:rPr>
-          <w:rFonts w:ascii="Times New Roman" w:hAnsi="Times New Roman" w:cs="Times New Roman"/>
-          <w:b/>
-          <w:bCs/>
-        </w:rPr>
-      </w:pPr>
-      <w:r>
-        <w:rPr>
-          <w:rFonts w:ascii="Times New Roman" w:hAnsi="Times New Roman" w:cs="Times New Roman"/>
-          <w:b/>
-          <w:bCs/>
-        </w:rPr>
-        <w:t>&gt; python -m pip install passlib</w:t>
-      </w:r>
+        <w:t>shibboleth-</w:t>
+      </w:r>
+      <w:proofErr w:type="spellStart"/>
+      <w:r>
+        <w:rPr>
+          <w:rFonts w:ascii="Times New Roman" w:hAnsi="Times New Roman" w:cs="Times New Roman"/>
+          <w:b/>
+          <w:bCs/>
+        </w:rPr>
+        <w:t>idp</w:t>
+      </w:r>
+      <w:proofErr w:type="spellEnd"/>
+      <w:r>
+        <w:rPr>
+          <w:rFonts w:ascii="Times New Roman" w:hAnsi="Times New Roman" w:cs="Times New Roman"/>
+          <w:b/>
+          <w:bCs/>
+        </w:rPr>
+        <w:t>\conf\</w:t>
+      </w:r>
+      <w:proofErr w:type="spellStart"/>
+      <w:r>
+        <w:rPr>
+          <w:rFonts w:ascii="Times New Roman" w:hAnsi="Times New Roman" w:cs="Times New Roman"/>
+          <w:b/>
+          <w:bCs/>
+        </w:rPr>
+        <w:t>authn</w:t>
+      </w:r>
+      <w:proofErr w:type="spellEnd"/>
+      <w:r>
+        <w:rPr>
+          <w:rFonts w:ascii="Times New Roman" w:hAnsi="Times New Roman" w:cs="Times New Roman"/>
+          <w:b/>
+          <w:bCs/>
+        </w:rPr>
+        <w:t xml:space="preserve">\htpasswd.txt </w:t>
+      </w:r>
+      <w:proofErr w:type="spellStart"/>
+      <w:r>
+        <w:rPr>
+          <w:rFonts w:ascii="Times New Roman" w:hAnsi="Times New Roman" w:cs="Times New Roman"/>
+          <w:b/>
+          <w:bCs/>
+        </w:rPr>
+        <w:t>testuser</w:t>
+      </w:r>
+      <w:proofErr w:type="spellEnd"/>
+    </w:p>
+    <w:p>
+      <w:pPr>
+        <w:rPr>
+          <w:rFonts w:ascii="Times New Roman" w:hAnsi="Times New Roman" w:cs="Times New Roman"/>
+        </w:rPr>
+      </w:pPr>
+      <w:r>
+        <w:rPr>
+          <w:rFonts w:ascii="Times New Roman" w:hAnsi="Times New Roman" w:cs="Times New Roman"/>
+        </w:rPr>
+        <w:t xml:space="preserve">Or we can use Python </w:t>
+      </w:r>
+      <w:proofErr w:type="spellStart"/>
+      <w:r>
+        <w:rPr>
+          <w:rFonts w:ascii="Times New Roman" w:hAnsi="Times New Roman" w:cs="Times New Roman"/>
+        </w:rPr>
+        <w:t>passLib</w:t>
+      </w:r>
+      <w:proofErr w:type="spellEnd"/>
+      <w:r>
+        <w:rPr>
+          <w:rFonts w:ascii="Times New Roman" w:hAnsi="Times New Roman" w:cs="Times New Roman"/>
+        </w:rPr>
+        <w:t>:</w:t>
+      </w:r>
+    </w:p>
+    <w:p>
+      <w:pPr>
+        <w:rPr>
+          <w:rFonts w:ascii="Times New Roman" w:hAnsi="Times New Roman" w:cs="Times New Roman"/>
+          <w:b/>
+          <w:bCs/>
+        </w:rPr>
+      </w:pPr>
+      <w:r>
+        <w:rPr>
+          <w:rFonts w:ascii="Times New Roman" w:hAnsi="Times New Roman" w:cs="Times New Roman"/>
+          <w:b/>
+          <w:bCs/>
+        </w:rPr>
+        <w:t xml:space="preserve">&gt; python -m pip install </w:t>
+      </w:r>
+      <w:proofErr w:type="spellStart"/>
+      <w:r>
+        <w:rPr>
+          <w:rFonts w:ascii="Times New Roman" w:hAnsi="Times New Roman" w:cs="Times New Roman"/>
+          <w:b/>
+          <w:bCs/>
+        </w:rPr>
+        <w:t>passlib</w:t>
+      </w:r>
+      <w:proofErr w:type="spellEnd"/>
     </w:p>
     <w:p>
       <w:pPr>
@@ -3610,7 +4243,7 @@
         </w:rPr>
         <w:t xml:space="preserve">&gt; python -c "from </w:t>
       </w:r>
-      <w:proofErr w:type="gramStart"/>
+      <w:proofErr w:type="spellStart"/>
       <w:r>
         <w:rPr>
           <w:rFonts w:ascii="Times New Roman" w:hAnsi="Times New Roman" w:cs="Times New Roman"/>
@@ -3619,50 +4252,14 @@
         </w:rPr>
         <w:t>passlib.hash</w:t>
       </w:r>
-      <w:proofErr w:type="gramEnd"/>
-      <w:r>
-        <w:rPr>
-          <w:rFonts w:ascii="Times New Roman" w:hAnsi="Times New Roman" w:cs="Times New Roman"/>
-          <w:b/>
-          <w:bCs/>
-        </w:rPr>
-        <w:t xml:space="preserve"> import sha512_</w:t>
-      </w:r>
-      <w:proofErr w:type="gramStart"/>
-      <w:r>
-        <w:rPr>
-          <w:rFonts w:ascii="Times New Roman" w:hAnsi="Times New Roman" w:cs="Times New Roman"/>
-          <w:b/>
-          <w:bCs/>
-        </w:rPr>
-        <w:t>crypt;print</w:t>
-      </w:r>
-      <w:proofErr w:type="gramEnd"/>
-      <w:r>
-        <w:rPr>
-          <w:rFonts w:ascii="Times New Roman" w:hAnsi="Times New Roman" w:cs="Times New Roman"/>
-          <w:b/>
-          <w:bCs/>
-        </w:rPr>
-        <w:t>(sha512_</w:t>
-      </w:r>
-      <w:proofErr w:type="gramStart"/>
-      <w:r>
-        <w:rPr>
-          <w:rFonts w:ascii="Times New Roman" w:hAnsi="Times New Roman" w:cs="Times New Roman"/>
-          <w:b/>
-          <w:bCs/>
-        </w:rPr>
-        <w:t>crypt.hash</w:t>
-      </w:r>
-      <w:proofErr w:type="gramEnd"/>
-      <w:r>
-        <w:rPr>
-          <w:rFonts w:ascii="Times New Roman" w:hAnsi="Times New Roman" w:cs="Times New Roman"/>
-          <w:b/>
-          <w:bCs/>
-        </w:rPr>
-        <w:t>('Test123!'))"</w:t>
+      <w:proofErr w:type="spellEnd"/>
+      <w:r>
+        <w:rPr>
+          <w:rFonts w:ascii="Times New Roman" w:hAnsi="Times New Roman" w:cs="Times New Roman"/>
+          <w:b/>
+          <w:bCs/>
+        </w:rPr>
+        <w:t xml:space="preserve"> import sha512_crypt;print(sha512_crypt.hash('Test123!'))"</w:t>
       </w:r>
     </w:p>
     <w:p>
@@ -3827,7 +4424,25 @@
           <w:b/>
           <w:bCs/>
         </w:rPr>
-        <w:t>%PROJECT_HOME%\shibboleth-idp\conf\relying-party.xml</w:t>
+        <w:t>%PROJECT_HOME%\shibboleth-</w:t>
+      </w:r>
+      <w:proofErr w:type="spellStart"/>
+      <w:r>
+        <w:rPr>
+          <w:rFonts w:ascii="Times New Roman" w:hAnsi="Times New Roman" w:cs="Times New Roman"/>
+          <w:b/>
+          <w:bCs/>
+        </w:rPr>
+        <w:t>idp</w:t>
+      </w:r>
+      <w:proofErr w:type="spellEnd"/>
+      <w:r>
+        <w:rPr>
+          <w:rFonts w:ascii="Times New Roman" w:hAnsi="Times New Roman" w:cs="Times New Roman"/>
+          <w:b/>
+          <w:bCs/>
+        </w:rPr>
+        <w:t>\conf\relying-party.xml</w:t>
       </w:r>
       <w:r>
         <w:rPr>
@@ -3991,8 +4606,18 @@
           <w:b/>
           <w:bCs/>
         </w:rPr>
-        <w:t>%PROJECT_HOME%\shibboleth-idp</w:t>
-      </w:r>
+        <w:t>%PROJECT_HOME%\shibboleth-</w:t>
+      </w:r>
+      <w:proofErr w:type="spellStart"/>
+      <w:r>
+        <w:rPr>
+          <w:rFonts w:ascii="Times New Roman" w:hAnsi="Times New Roman" w:cs="Times New Roman"/>
+          <w:b/>
+          <w:bCs/>
+        </w:rPr>
+        <w:t>idp</w:t>
+      </w:r>
+      <w:proofErr w:type="spellEnd"/>
       <w:r>
         <w:rPr>
           <w:rFonts w:ascii="Times New Roman" w:hAnsi="Times New Roman" w:cs="Times New Roman"/>
@@ -4049,7 +4674,21 @@
         <w:rPr>
           <w:rFonts w:ascii="Times New Roman" w:hAnsi="Times New Roman" w:cs="Times New Roman"/>
         </w:rPr>
-        <w:t>reate an internal attribute called uid, and set its value to the username/principal that successfully authenticated</w:t>
+        <w:t xml:space="preserve">reate an internal attribute called </w:t>
+      </w:r>
+      <w:proofErr w:type="spellStart"/>
+      <w:r>
+        <w:rPr>
+          <w:rFonts w:ascii="Times New Roman" w:hAnsi="Times New Roman" w:cs="Times New Roman"/>
+        </w:rPr>
+        <w:t>uid</w:t>
+      </w:r>
+      <w:proofErr w:type="spellEnd"/>
+      <w:r>
+        <w:rPr>
+          <w:rFonts w:ascii="Times New Roman" w:hAnsi="Times New Roman" w:cs="Times New Roman"/>
+        </w:rPr>
+        <w:t>, and set its value to the username/principal that successfully authenticated</w:t>
       </w:r>
       <w:r>
         <w:rPr>
@@ -4139,8 +4778,18 @@
           <w:b/>
           <w:bCs/>
         </w:rPr>
-        <w:t>%PROJECT_HOME%\shibboleth-idp</w:t>
-      </w:r>
+        <w:t>%PROJECT_HOME%\shibboleth-</w:t>
+      </w:r>
+      <w:proofErr w:type="spellStart"/>
+      <w:r>
+        <w:rPr>
+          <w:rFonts w:ascii="Times New Roman" w:hAnsi="Times New Roman" w:cs="Times New Roman"/>
+          <w:b/>
+          <w:bCs/>
+        </w:rPr>
+        <w:t>idp</w:t>
+      </w:r>
+      <w:proofErr w:type="spellEnd"/>
       <w:r>
         <w:rPr>
           <w:rFonts w:ascii="Times New Roman" w:hAnsi="Times New Roman" w:cs="Times New Roman"/>
@@ -4199,7 +4848,19 @@
         <w:rPr>
           <w:rFonts w:ascii="Times New Roman" w:hAnsi="Times New Roman" w:cs="Times New Roman"/>
         </w:rPr>
-        <w:t>controls which attributes Shibboleth is allowed to send to your Spring Boot application.</w:t>
+        <w:t xml:space="preserve">controls </w:t>
+      </w:r>
+      <w:r>
+        <w:rPr>
+          <w:rFonts w:ascii="Times New Roman" w:hAnsi="Times New Roman" w:cs="Times New Roman"/>
+        </w:rPr>
+        <w:t>what</w:t>
+      </w:r>
+      <w:r>
+        <w:rPr>
+          <w:rFonts w:ascii="Times New Roman" w:hAnsi="Times New Roman" w:cs="Times New Roman"/>
+        </w:rPr>
+        <w:t xml:space="preserve"> attributes Shibboleth is allowed to send to your Spring Boot application.</w:t>
       </w:r>
     </w:p>
     <w:p>
@@ -4268,6 +4929,12 @@
         <w:rPr>
           <w:rFonts w:ascii="Times New Roman" w:hAnsi="Times New Roman" w:cs="Times New Roman"/>
         </w:rPr>
+        <w:t xml:space="preserve">Stop and </w:t>
+      </w:r>
+      <w:r>
+        <w:rPr>
+          <w:rFonts w:ascii="Times New Roman" w:hAnsi="Times New Roman" w:cs="Times New Roman"/>
+        </w:rPr>
         <w:t>Restart Jetty server:</w:t>
       </w:r>
     </w:p>
@@ -4285,7 +4952,15 @@
           <w:b/>
           <w:bCs/>
         </w:rPr>
-        <w:t>&gt; bin\runjetty.bat</w:t>
+        <w:t xml:space="preserve">&gt; </w:t>
+      </w:r>
+      <w:r>
+        <w:rPr>
+          <w:rFonts w:ascii="Times New Roman" w:hAnsi="Times New Roman" w:cs="Times New Roman"/>
+          <w:b/>
+          <w:bCs/>
+        </w:rPr>
+        <w:t>start_shibboleth_jetty.bat</w:t>
       </w:r>
     </w:p>
     <w:p>
@@ -4338,6 +5013,99 @@
           <w:szCs w:val="28"/>
         </w:rPr>
         <w:t>nstration</w:t>
+      </w:r>
+    </w:p>
+    <w:p>
+      <w:pPr>
+        <w:rPr>
+          <w:rFonts w:ascii="Times New Roman" w:hAnsi="Times New Roman" w:cs="Times New Roman"/>
+        </w:rPr>
+      </w:pPr>
+      <w:r>
+        <w:rPr>
+          <w:rFonts w:ascii="Times New Roman" w:hAnsi="Times New Roman" w:cs="Times New Roman"/>
+        </w:rPr>
+        <w:t>If your Shibboleth IdP server is not running, run this script to bring it up:</w:t>
+      </w:r>
+    </w:p>
+    <w:p>
+      <w:pPr>
+        <w:rPr>
+          <w:rFonts w:ascii="Times New Roman" w:hAnsi="Times New Roman" w:cs="Times New Roman"/>
+          <w:b/>
+          <w:bCs/>
+        </w:rPr>
+      </w:pPr>
+      <w:r>
+        <w:rPr>
+          <w:rFonts w:ascii="Times New Roman" w:hAnsi="Times New Roman" w:cs="Times New Roman"/>
+          <w:b/>
+          <w:bCs/>
+        </w:rPr>
+        <w:t>start_shibboleth_jetty.bat</w:t>
+      </w:r>
+    </w:p>
+    <w:p>
+      <w:pPr>
+        <w:rPr>
+          <w:rFonts w:ascii="Times New Roman" w:hAnsi="Times New Roman" w:cs="Times New Roman"/>
+        </w:rPr>
+      </w:pPr>
+      <w:r>
+        <w:rPr>
+          <w:rFonts w:ascii="Times New Roman" w:hAnsi="Times New Roman" w:cs="Times New Roman"/>
+        </w:rPr>
+        <w:t>If your Spring applications are not running, run these scripts to bring them up:</w:t>
+      </w:r>
+    </w:p>
+    <w:p>
+      <w:pPr>
+        <w:rPr>
+          <w:rFonts w:ascii="Times New Roman" w:hAnsi="Times New Roman" w:cs="Times New Roman"/>
+          <w:b/>
+          <w:bCs/>
+        </w:rPr>
+      </w:pPr>
+      <w:r>
+        <w:rPr>
+          <w:rFonts w:ascii="Times New Roman" w:hAnsi="Times New Roman" w:cs="Times New Roman"/>
+          <w:b/>
+          <w:bCs/>
+        </w:rPr>
+        <w:t>start_spring_app1.bat</w:t>
+      </w:r>
+    </w:p>
+    <w:p>
+      <w:pPr>
+        <w:rPr>
+          <w:rFonts w:ascii="Times New Roman" w:hAnsi="Times New Roman" w:cs="Times New Roman"/>
+          <w:b/>
+          <w:bCs/>
+        </w:rPr>
+      </w:pPr>
+      <w:r>
+        <w:rPr>
+          <w:rFonts w:ascii="Times New Roman" w:hAnsi="Times New Roman" w:cs="Times New Roman"/>
+          <w:b/>
+          <w:bCs/>
+        </w:rPr>
+        <w:t>start_spring_app</w:t>
+      </w:r>
+      <w:r>
+        <w:rPr>
+          <w:rFonts w:ascii="Times New Roman" w:hAnsi="Times New Roman" w:cs="Times New Roman"/>
+          <w:b/>
+          <w:bCs/>
+        </w:rPr>
+        <w:t>2</w:t>
+      </w:r>
+      <w:r>
+        <w:rPr>
+          <w:rFonts w:ascii="Times New Roman" w:hAnsi="Times New Roman" w:cs="Times New Roman"/>
+          <w:b/>
+          <w:bCs/>
+        </w:rPr>
+        <w:t>.bat</w:t>
       </w:r>
     </w:p>
     <w:p>
@@ -4454,7 +5222,21 @@
         <w:rPr>
           <w:rFonts w:ascii="Times New Roman" w:hAnsi="Times New Roman" w:cs="Times New Roman"/>
         </w:rPr>
-        <w:t>Enter yunpeng.li/password then click Login, it displays the homepage of application 1:</w:t>
+        <w:t xml:space="preserve">Enter yunpeng.li/password then click </w:t>
+      </w:r>
+      <w:r>
+        <w:rPr>
+          <w:rFonts w:ascii="Times New Roman" w:hAnsi="Times New Roman" w:cs="Times New Roman"/>
+          <w:b/>
+          <w:bCs/>
+        </w:rPr>
+        <w:t>Login</w:t>
+      </w:r>
+      <w:r>
+        <w:rPr>
+          <w:rFonts w:ascii="Times New Roman" w:hAnsi="Times New Roman" w:cs="Times New Roman"/>
+        </w:rPr>
+        <w:t>, it displays the homepage of application 1:</w:t>
       </w:r>
     </w:p>
     <w:p>
@@ -4586,18 +5368,29 @@
       <w:pPr>
         <w:rPr>
           <w:rFonts w:ascii="Times New Roman" w:hAnsi="Times New Roman" w:cs="Times New Roman"/>
-        </w:rPr>
-      </w:pPr>
-    </w:p>
-    <w:p>
-      <w:pPr>
-        <w:rPr>
-          <w:rFonts w:ascii="Times New Roman" w:hAnsi="Times New Roman" w:cs="Times New Roman"/>
-        </w:rPr>
-      </w:pPr>
-      <w:r>
-        <w:rPr>
-          <w:rFonts w:ascii="Times New Roman" w:hAnsi="Times New Roman" w:cs="Times New Roman"/>
+          <w:b/>
+          <w:bCs/>
+        </w:rPr>
+      </w:pPr>
+      <w:r>
+        <w:rPr>
+          <w:rFonts w:ascii="Times New Roman" w:hAnsi="Times New Roman" w:cs="Times New Roman"/>
+          <w:b/>
+          <w:bCs/>
+        </w:rPr>
+        <w:t>Architecture Diagram:</w:t>
+      </w:r>
+    </w:p>
+    <w:p>
+      <w:pPr>
+        <w:rPr>
+          <w:rFonts w:ascii="Times New Roman" w:hAnsi="Times New Roman" w:cs="Times New Roman"/>
+        </w:rPr>
+      </w:pPr>
+      <w:r>
+        <w:rPr>
+          <w:rFonts w:ascii="Times New Roman" w:hAnsi="Times New Roman" w:cs="Times New Roman"/>
+          <w:noProof/>
         </w:rPr>
         <w:drawing>
           <wp:inline distT="0" distB="0" distL="0" distR="0" wp14:anchorId="3E7B041B" wp14:editId="4E3E9F9F">

</xml_diff>

<commit_message>
Added important config files and updated doc
</commit_message>
<xml_diff>
--- a/docs/Configure Shibboleth SAML for Spring Boot Applications More Secure.docx
+++ b/docs/Configure Shibboleth SAML for Spring Boot Applications More Secure.docx
@@ -4259,7 +4259,39 @@
           <w:b/>
           <w:bCs/>
         </w:rPr>
-        <w:t xml:space="preserve"> import sha512_crypt;print(sha512_crypt.hash('Test123!'))"</w:t>
+        <w:t xml:space="preserve"> import</w:t>
+      </w:r>
+      <w:r>
+        <w:rPr>
+          <w:rFonts w:ascii="Times New Roman" w:hAnsi="Times New Roman" w:cs="Times New Roman"/>
+          <w:b/>
+          <w:bCs/>
+        </w:rPr>
+        <w:t xml:space="preserve"> </w:t>
+      </w:r>
+      <w:r>
+        <w:rPr>
+          <w:rFonts w:ascii="Times New Roman" w:hAnsi="Times New Roman" w:cs="Times New Roman"/>
+          <w:b/>
+          <w:bCs/>
+        </w:rPr>
+        <w:t>sha512_crypt;print(sha512_crypt.hash('</w:t>
+      </w:r>
+      <w:r>
+        <w:rPr>
+          <w:rFonts w:ascii="Times New Roman" w:hAnsi="Times New Roman" w:cs="Times New Roman"/>
+          <w:b/>
+          <w:bCs/>
+        </w:rPr>
+        <w:t>password</w:t>
+      </w:r>
+      <w:r>
+        <w:rPr>
+          <w:rFonts w:ascii="Times New Roman" w:hAnsi="Times New Roman" w:cs="Times New Roman"/>
+          <w:b/>
+          <w:bCs/>
+        </w:rPr>
+        <w:t>'))"</w:t>
       </w:r>
     </w:p>
     <w:p>
@@ -5089,23 +5121,7 @@
           <w:b/>
           <w:bCs/>
         </w:rPr>
-        <w:t>start_spring_app</w:t>
-      </w:r>
-      <w:r>
-        <w:rPr>
-          <w:rFonts w:ascii="Times New Roman" w:hAnsi="Times New Roman" w:cs="Times New Roman"/>
-          <w:b/>
-          <w:bCs/>
-        </w:rPr>
-        <w:t>2</w:t>
-      </w:r>
-      <w:r>
-        <w:rPr>
-          <w:rFonts w:ascii="Times New Roman" w:hAnsi="Times New Roman" w:cs="Times New Roman"/>
-          <w:b/>
-          <w:bCs/>
-        </w:rPr>
-        <w:t>.bat</w:t>
+        <w:t>start_spring_app2.bat</w:t>
       </w:r>
     </w:p>
     <w:p>

</xml_diff>